<commit_message>
Versão 1.0.0 - Especificação de Caso de Uso
</commit_message>
<xml_diff>
--- a/Especificação de Caso de Uso - Vitta.docx
+++ b/Especificação de Caso de Uso - Vitta.docx
@@ -602,7 +602,7 @@
                 <w:szCs w:val="20"/>
                 <w:rtl w:val="0"/>
               </w:rPr>
-              <w:t xml:space="preserve">07/04/2026</w:t>
+              <w:t xml:space="preserve">10/04/2026</w:t>
             </w:r>
           </w:p>
         </w:tc>
@@ -691,7 +691,7 @@
                 <w:szCs w:val="20"/>
                 <w:rtl w:val="0"/>
               </w:rPr>
-              <w:t xml:space="preserve">Inclusão da especificação do caso de uso “Agendar Doação de Sangue”.</w:t>
+              <w:t xml:space="preserve">Criação/Inclusão da especificação dos casos de uso “Agendar Doação de Sangue”, “Cadastro e Login”, “Visualizar instituições de Saúde Próximas” e “Visualizar Históricos de Doações”.</w:t>
             </w:r>
           </w:p>
         </w:tc>
@@ -738,593 +738,7 @@
                 <w:szCs w:val="20"/>
                 <w:rtl w:val="0"/>
               </w:rPr>
-              <w:t xml:space="preserve">Enzo Gomide</w:t>
-            </w:r>
-          </w:p>
-        </w:tc>
-      </w:tr>
-      <w:tr>
-        <w:trPr>
-          <w:cantSplit w:val="0"/>
-          <w:tblHeader w:val="1"/>
-        </w:trPr>
-        <w:tc>
-          <w:tcPr>
-            <w:tcMar>
-              <w:top w:w="113.38582677165356" w:type="dxa"/>
-              <w:left w:w="113.38582677165356" w:type="dxa"/>
-              <w:bottom w:w="113.38582677165356" w:type="dxa"/>
-              <w:right w:w="113.38582677165356" w:type="dxa"/>
-            </w:tcMar>
-            <w:vAlign w:val="center"/>
-          </w:tcPr>
-          <w:p>
-            <w:pPr>
-              <w:keepNext w:val="0"/>
-              <w:keepLines w:val="0"/>
-              <w:widowControl w:val="0"/>
-              <w:pBdr>
-                <w:top w:space="0" w:sz="0" w:val="nil"/>
-                <w:left w:space="0" w:sz="0" w:val="nil"/>
-                <w:bottom w:space="0" w:sz="0" w:val="nil"/>
-                <w:right w:space="0" w:sz="0" w:val="nil"/>
-                <w:between w:space="0" w:sz="0" w:val="nil"/>
-              </w:pBdr>
-              <w:shd w:fill="auto" w:val="clear"/>
-              <w:spacing w:after="0" w:before="0" w:line="240" w:lineRule="auto"/>
-              <w:ind w:left="0" w:right="0" w:firstLine="0"/>
-              <w:jc w:val="center"/>
-              <w:rPr>
-                <w:b w:val="1"/>
-                <w:bCs w:val="1"/>
-                <w:sz w:val="20"/>
-                <w:szCs w:val="20"/>
-              </w:rPr>
-            </w:pPr>
-            <w:r>
-              <w:rPr>
-                <w:b w:val="1"/>
-                <w:bCs w:val="1"/>
-                <w:sz w:val="20"/>
-                <w:szCs w:val="20"/>
-                <w:rtl w:val="0"/>
-              </w:rPr>
-              <w:t xml:space="preserve">06/04/2026</w:t>
-            </w:r>
-          </w:p>
-        </w:tc>
-        <w:tc>
-          <w:tcPr>
-            <w:tcMar>
-              <w:top w:w="113.38582677165356" w:type="dxa"/>
-              <w:left w:w="113.38582677165356" w:type="dxa"/>
-              <w:bottom w:w="113.38582677165356" w:type="dxa"/>
-              <w:right w:w="113.38582677165356" w:type="dxa"/>
-            </w:tcMar>
-            <w:vAlign w:val="center"/>
-          </w:tcPr>
-          <w:p>
-            <w:pPr>
-              <w:keepNext w:val="0"/>
-              <w:keepLines w:val="0"/>
-              <w:widowControl w:val="0"/>
-              <w:pBdr>
-                <w:top w:space="0" w:sz="0" w:val="nil"/>
-                <w:left w:space="0" w:sz="0" w:val="nil"/>
-                <w:bottom w:space="0" w:sz="0" w:val="nil"/>
-                <w:right w:space="0" w:sz="0" w:val="nil"/>
-                <w:between w:space="0" w:sz="0" w:val="nil"/>
-              </w:pBdr>
-              <w:shd w:fill="auto" w:val="clear"/>
-              <w:spacing w:after="0" w:before="0" w:line="240" w:lineRule="auto"/>
-              <w:ind w:left="0" w:right="0" w:firstLine="0"/>
-              <w:jc w:val="center"/>
-              <w:rPr>
-                <w:b w:val="1"/>
-                <w:bCs w:val="1"/>
-                <w:sz w:val="20"/>
-                <w:szCs w:val="20"/>
-              </w:rPr>
-            </w:pPr>
-            <w:r>
-              <w:rPr>
-                <w:b w:val="1"/>
-                <w:bCs w:val="1"/>
-                <w:sz w:val="20"/>
-                <w:szCs w:val="20"/>
-                <w:rtl w:val="0"/>
-              </w:rPr>
-              <w:t xml:space="preserve">1.0</w:t>
-            </w:r>
-          </w:p>
-        </w:tc>
-        <w:tc>
-          <w:tcPr>
-            <w:tcMar>
-              <w:top w:w="113.38582677165356" w:type="dxa"/>
-              <w:left w:w="113.38582677165356" w:type="dxa"/>
-              <w:bottom w:w="113.38582677165356" w:type="dxa"/>
-              <w:right w:w="113.38582677165356" w:type="dxa"/>
-            </w:tcMar>
-            <w:vAlign w:val="center"/>
-          </w:tcPr>
-          <w:p>
-            <w:pPr>
-              <w:keepNext w:val="0"/>
-              <w:keepLines w:val="0"/>
-              <w:widowControl w:val="0"/>
-              <w:pBdr>
-                <w:top w:space="0" w:sz="0" w:val="nil"/>
-                <w:left w:space="0" w:sz="0" w:val="nil"/>
-                <w:bottom w:space="0" w:sz="0" w:val="nil"/>
-                <w:right w:space="0" w:sz="0" w:val="nil"/>
-                <w:between w:space="0" w:sz="0" w:val="nil"/>
-              </w:pBdr>
-              <w:shd w:fill="auto" w:val="clear"/>
-              <w:spacing w:after="0" w:before="0" w:line="240" w:lineRule="auto"/>
-              <w:ind w:left="0" w:right="0" w:firstLine="0"/>
-              <w:rPr>
-                <w:sz w:val="20"/>
-                <w:szCs w:val="20"/>
-              </w:rPr>
-            </w:pPr>
-            <w:r>
-              <w:rPr>
-                <w:sz w:val="20"/>
-                <w:szCs w:val="20"/>
-                <w:rtl w:val="0"/>
-              </w:rPr>
-              <w:t xml:space="preserve">Primeira Versão do Caso De Uso (login)</w:t>
-            </w:r>
-          </w:p>
-        </w:tc>
-        <w:tc>
-          <w:tcPr>
-            <w:tcMar>
-              <w:top w:w="113.38582677165356" w:type="dxa"/>
-              <w:left w:w="113.38582677165356" w:type="dxa"/>
-              <w:bottom w:w="113.38582677165356" w:type="dxa"/>
-              <w:right w:w="113.38582677165356" w:type="dxa"/>
-            </w:tcMar>
-            <w:vAlign w:val="center"/>
-          </w:tcPr>
-          <w:p>
-            <w:pPr>
-              <w:keepNext w:val="0"/>
-              <w:keepLines w:val="0"/>
-              <w:widowControl w:val="0"/>
-              <w:pBdr>
-                <w:top w:space="0" w:sz="0" w:val="nil"/>
-                <w:left w:space="0" w:sz="0" w:val="nil"/>
-                <w:bottom w:space="0" w:sz="0" w:val="nil"/>
-                <w:right w:space="0" w:sz="0" w:val="nil"/>
-                <w:between w:space="0" w:sz="0" w:val="nil"/>
-              </w:pBdr>
-              <w:shd w:fill="auto" w:val="clear"/>
-              <w:spacing w:after="0" w:before="0" w:line="240" w:lineRule="auto"/>
-              <w:ind w:left="0" w:right="0" w:firstLine="0"/>
-              <w:jc w:val="center"/>
-              <w:rPr>
-                <w:b w:val="1"/>
-                <w:bCs w:val="1"/>
-                <w:sz w:val="20"/>
-                <w:szCs w:val="20"/>
-              </w:rPr>
-            </w:pPr>
-            <w:r>
-              <w:rPr>
-                <w:b w:val="1"/>
-                <w:bCs w:val="1"/>
-                <w:sz w:val="20"/>
-                <w:szCs w:val="20"/>
-                <w:rtl w:val="0"/>
-              </w:rPr>
-              <w:t xml:space="preserve">Guilherme Ayala</w:t>
-            </w:r>
-          </w:p>
-        </w:tc>
-      </w:tr>
-      <w:tr>
-        <w:trPr>
-          <w:cantSplit w:val="0"/>
-          <w:tblHeader w:val="1"/>
-        </w:trPr>
-        <w:tc>
-          <w:tcPr>
-            <w:tcMar>
-              <w:top w:w="113.38582677165356" w:type="dxa"/>
-              <w:left w:w="113.38582677165356" w:type="dxa"/>
-              <w:bottom w:w="113.38582677165356" w:type="dxa"/>
-              <w:right w:w="113.38582677165356" w:type="dxa"/>
-            </w:tcMar>
-            <w:vAlign w:val="center"/>
-          </w:tcPr>
-          <w:p>
-            <w:pPr>
-              <w:keepNext w:val="0"/>
-              <w:keepLines w:val="0"/>
-              <w:widowControl w:val="0"/>
-              <w:pBdr>
-                <w:top w:space="0" w:sz="0" w:val="nil"/>
-                <w:left w:space="0" w:sz="0" w:val="nil"/>
-                <w:bottom w:space="0" w:sz="0" w:val="nil"/>
-                <w:right w:space="0" w:sz="0" w:val="nil"/>
-                <w:between w:space="0" w:sz="0" w:val="nil"/>
-              </w:pBdr>
-              <w:shd w:fill="auto" w:val="clear"/>
-              <w:spacing w:after="0" w:before="0" w:line="240" w:lineRule="auto"/>
-              <w:ind w:left="0" w:right="0" w:firstLine="0"/>
-              <w:jc w:val="center"/>
-              <w:rPr>
-                <w:b w:val="1"/>
-                <w:bCs w:val="1"/>
-                <w:sz w:val="20"/>
-                <w:szCs w:val="20"/>
-              </w:rPr>
-            </w:pPr>
-            <w:r>
-              <w:rPr>
-                <w:b w:val="1"/>
-                <w:bCs w:val="1"/>
-                <w:sz w:val="20"/>
-                <w:szCs w:val="20"/>
-                <w:rtl w:val="0"/>
-              </w:rPr>
-              <w:t xml:space="preserve">06/04/2026</w:t>
-            </w:r>
-          </w:p>
-          <w:p>
-            <w:pPr>
-              <w:keepNext w:val="0"/>
-              <w:keepLines w:val="0"/>
-              <w:widowControl w:val="0"/>
-              <w:pBdr>
-                <w:top w:space="0" w:sz="0" w:val="nil"/>
-                <w:left w:space="0" w:sz="0" w:val="nil"/>
-                <w:bottom w:space="0" w:sz="0" w:val="nil"/>
-                <w:right w:space="0" w:sz="0" w:val="nil"/>
-                <w:between w:space="0" w:sz="0" w:val="nil"/>
-              </w:pBdr>
-              <w:shd w:fill="auto" w:val="clear"/>
-              <w:spacing w:after="0" w:before="0" w:line="240" w:lineRule="auto"/>
-              <w:ind w:left="0" w:right="0" w:firstLine="0"/>
-              <w:jc w:val="center"/>
-              <w:rPr>
-                <w:b w:val="1"/>
-                <w:bCs w:val="1"/>
-                <w:sz w:val="20"/>
-                <w:szCs w:val="20"/>
-              </w:rPr>
-            </w:pPr>
-            <w:r>
-              <w:rPr>
-                <w:rtl w:val="0"/>
-              </w:rPr>
-            </w:r>
-          </w:p>
-        </w:tc>
-        <w:tc>
-          <w:tcPr>
-            <w:tcMar>
-              <w:top w:w="113.38582677165356" w:type="dxa"/>
-              <w:left w:w="113.38582677165356" w:type="dxa"/>
-              <w:bottom w:w="113.38582677165356" w:type="dxa"/>
-              <w:right w:w="113.38582677165356" w:type="dxa"/>
-            </w:tcMar>
-            <w:vAlign w:val="center"/>
-          </w:tcPr>
-          <w:p>
-            <w:pPr>
-              <w:keepNext w:val="0"/>
-              <w:keepLines w:val="0"/>
-              <w:widowControl w:val="0"/>
-              <w:pBdr>
-                <w:top w:space="0" w:sz="0" w:val="nil"/>
-                <w:left w:space="0" w:sz="0" w:val="nil"/>
-                <w:bottom w:space="0" w:sz="0" w:val="nil"/>
-                <w:right w:space="0" w:sz="0" w:val="nil"/>
-                <w:between w:space="0" w:sz="0" w:val="nil"/>
-              </w:pBdr>
-              <w:shd w:fill="auto" w:val="clear"/>
-              <w:spacing w:after="0" w:before="0" w:line="240" w:lineRule="auto"/>
-              <w:ind w:left="0" w:right="0" w:firstLine="0"/>
-              <w:jc w:val="center"/>
-              <w:rPr>
-                <w:b w:val="1"/>
-                <w:bCs w:val="1"/>
-                <w:sz w:val="20"/>
-                <w:szCs w:val="20"/>
-              </w:rPr>
-            </w:pPr>
-            <w:r>
-              <w:rPr>
-                <w:b w:val="1"/>
-                <w:bCs w:val="1"/>
-                <w:sz w:val="20"/>
-                <w:szCs w:val="20"/>
-                <w:rtl w:val="0"/>
-              </w:rPr>
-              <w:t xml:space="preserve">1.0</w:t>
-            </w:r>
-          </w:p>
-          <w:p>
-            <w:pPr>
-              <w:keepNext w:val="0"/>
-              <w:keepLines w:val="0"/>
-              <w:widowControl w:val="0"/>
-              <w:pBdr>
-                <w:top w:space="0" w:sz="0" w:val="nil"/>
-                <w:left w:space="0" w:sz="0" w:val="nil"/>
-                <w:bottom w:space="0" w:sz="0" w:val="nil"/>
-                <w:right w:space="0" w:sz="0" w:val="nil"/>
-                <w:between w:space="0" w:sz="0" w:val="nil"/>
-              </w:pBdr>
-              <w:shd w:fill="auto" w:val="clear"/>
-              <w:spacing w:after="0" w:before="0" w:line="240" w:lineRule="auto"/>
-              <w:ind w:left="0" w:right="0" w:firstLine="0"/>
-              <w:jc w:val="center"/>
-              <w:rPr>
-                <w:b w:val="1"/>
-                <w:bCs w:val="1"/>
-                <w:sz w:val="20"/>
-                <w:szCs w:val="20"/>
-              </w:rPr>
-            </w:pPr>
-            <w:r>
-              <w:rPr>
-                <w:rtl w:val="0"/>
-              </w:rPr>
-            </w:r>
-          </w:p>
-        </w:tc>
-        <w:tc>
-          <w:tcPr>
-            <w:tcMar>
-              <w:top w:w="113.38582677165356" w:type="dxa"/>
-              <w:left w:w="113.38582677165356" w:type="dxa"/>
-              <w:bottom w:w="113.38582677165356" w:type="dxa"/>
-              <w:right w:w="113.38582677165356" w:type="dxa"/>
-            </w:tcMar>
-            <w:vAlign w:val="center"/>
-          </w:tcPr>
-          <w:p>
-            <w:pPr>
-              <w:keepNext w:val="0"/>
-              <w:keepLines w:val="0"/>
-              <w:widowControl w:val="0"/>
-              <w:pBdr>
-                <w:top w:space="0" w:sz="0" w:val="nil"/>
-                <w:left w:space="0" w:sz="0" w:val="nil"/>
-                <w:bottom w:space="0" w:sz="0" w:val="nil"/>
-                <w:right w:space="0" w:sz="0" w:val="nil"/>
-                <w:between w:space="0" w:sz="0" w:val="nil"/>
-              </w:pBdr>
-              <w:shd w:fill="auto" w:val="clear"/>
-              <w:spacing w:after="0" w:before="0" w:line="240" w:lineRule="auto"/>
-              <w:ind w:left="0" w:right="0" w:firstLine="0"/>
-              <w:rPr>
-                <w:sz w:val="20"/>
-                <w:szCs w:val="20"/>
-              </w:rPr>
-            </w:pPr>
-            <w:r>
-              <w:rPr>
-                <w:sz w:val="20"/>
-                <w:szCs w:val="20"/>
-                <w:rtl w:val="0"/>
-              </w:rPr>
-              <w:t xml:space="preserve">Criação do documento de especificação de caso de uso (hemocentros próximos)</w:t>
-            </w:r>
-          </w:p>
-        </w:tc>
-        <w:tc>
-          <w:tcPr>
-            <w:tcMar>
-              <w:top w:w="113.38582677165356" w:type="dxa"/>
-              <w:left w:w="113.38582677165356" w:type="dxa"/>
-              <w:bottom w:w="113.38582677165356" w:type="dxa"/>
-              <w:right w:w="113.38582677165356" w:type="dxa"/>
-            </w:tcMar>
-            <w:vAlign w:val="center"/>
-          </w:tcPr>
-          <w:p>
-            <w:pPr>
-              <w:keepNext w:val="0"/>
-              <w:keepLines w:val="0"/>
-              <w:widowControl w:val="0"/>
-              <w:pBdr>
-                <w:top w:space="0" w:sz="0" w:val="nil"/>
-                <w:left w:space="0" w:sz="0" w:val="nil"/>
-                <w:bottom w:space="0" w:sz="0" w:val="nil"/>
-                <w:right w:space="0" w:sz="0" w:val="nil"/>
-                <w:between w:space="0" w:sz="0" w:val="nil"/>
-              </w:pBdr>
-              <w:shd w:fill="auto" w:val="clear"/>
-              <w:spacing w:after="0" w:before="0" w:line="240" w:lineRule="auto"/>
-              <w:ind w:left="0" w:right="0" w:firstLine="0"/>
-              <w:jc w:val="center"/>
-              <w:rPr>
-                <w:b w:val="1"/>
-                <w:bCs w:val="1"/>
-                <w:sz w:val="20"/>
-                <w:szCs w:val="20"/>
-              </w:rPr>
-            </w:pPr>
-            <w:r>
-              <w:rPr>
-                <w:b w:val="1"/>
-                <w:bCs w:val="1"/>
-                <w:sz w:val="20"/>
-                <w:szCs w:val="20"/>
-                <w:rtl w:val="0"/>
-              </w:rPr>
-              <w:t xml:space="preserve">Dimitri Vieira e Gustavo Anisio</w:t>
-            </w:r>
-          </w:p>
-          <w:p>
-            <w:pPr>
-              <w:keepNext w:val="0"/>
-              <w:keepLines w:val="0"/>
-              <w:widowControl w:val="0"/>
-              <w:pBdr>
-                <w:top w:space="0" w:sz="0" w:val="nil"/>
-                <w:left w:space="0" w:sz="0" w:val="nil"/>
-                <w:bottom w:space="0" w:sz="0" w:val="nil"/>
-                <w:right w:space="0" w:sz="0" w:val="nil"/>
-                <w:between w:space="0" w:sz="0" w:val="nil"/>
-              </w:pBdr>
-              <w:shd w:fill="auto" w:val="clear"/>
-              <w:spacing w:after="0" w:before="0" w:line="240" w:lineRule="auto"/>
-              <w:ind w:left="0" w:right="0" w:firstLine="0"/>
-              <w:jc w:val="center"/>
-              <w:rPr>
-                <w:b w:val="1"/>
-                <w:bCs w:val="1"/>
-                <w:sz w:val="20"/>
-                <w:szCs w:val="20"/>
-              </w:rPr>
-            </w:pPr>
-            <w:r>
-              <w:rPr>
-                <w:rtl w:val="0"/>
-              </w:rPr>
-            </w:r>
-          </w:p>
-        </w:tc>
-      </w:tr>
-      <w:tr>
-        <w:trPr>
-          <w:cantSplit w:val="0"/>
-          <w:tblHeader w:val="1"/>
-        </w:trPr>
-        <w:tc>
-          <w:tcPr>
-            <w:tcMar>
-              <w:top w:w="113.38582677165356" w:type="dxa"/>
-              <w:left w:w="113.38582677165356" w:type="dxa"/>
-              <w:bottom w:w="113.38582677165356" w:type="dxa"/>
-              <w:right w:w="113.38582677165356" w:type="dxa"/>
-            </w:tcMar>
-            <w:vAlign w:val="center"/>
-          </w:tcPr>
-          <w:p>
-            <w:pPr>
-              <w:spacing w:before="10" w:line="240" w:lineRule="auto"/>
-              <w:ind w:left="107" w:right="0" w:firstLine="0"/>
-              <w:jc w:val="center"/>
-              <w:rPr>
-                <w:b w:val="1"/>
-                <w:bCs w:val="1"/>
-                <w:sz w:val="20"/>
-                <w:szCs w:val="20"/>
-              </w:rPr>
-            </w:pPr>
-            <w:r>
-              <w:rPr>
-                <w:b w:val="1"/>
-                <w:bCs w:val="1"/>
-                <w:sz w:val="20"/>
-                <w:szCs w:val="20"/>
-                <w:rtl w:val="0"/>
-              </w:rPr>
-              <w:t xml:space="preserve">06/04/2026</w:t>
-            </w:r>
-          </w:p>
-        </w:tc>
-        <w:tc>
-          <w:tcPr>
-            <w:tcMar>
-              <w:top w:w="113.38582677165356" w:type="dxa"/>
-              <w:left w:w="113.38582677165356" w:type="dxa"/>
-              <w:bottom w:w="113.38582677165356" w:type="dxa"/>
-              <w:right w:w="113.38582677165356" w:type="dxa"/>
-            </w:tcMar>
-            <w:vAlign w:val="center"/>
-          </w:tcPr>
-          <w:p>
-            <w:pPr>
-              <w:spacing w:before="10" w:line="240" w:lineRule="auto"/>
-              <w:ind w:left="108" w:right="0" w:firstLine="0"/>
-              <w:jc w:val="center"/>
-              <w:rPr>
-                <w:b w:val="1"/>
-                <w:bCs w:val="1"/>
-                <w:sz w:val="20"/>
-                <w:szCs w:val="20"/>
-              </w:rPr>
-            </w:pPr>
-            <w:r>
-              <w:rPr>
-                <w:b w:val="1"/>
-                <w:bCs w:val="1"/>
-                <w:sz w:val="20"/>
-                <w:szCs w:val="20"/>
-                <w:rtl w:val="0"/>
-              </w:rPr>
-              <w:t xml:space="preserve">1.0</w:t>
-            </w:r>
-          </w:p>
-        </w:tc>
-        <w:tc>
-          <w:tcPr>
-            <w:tcMar>
-              <w:top w:w="113.38582677165356" w:type="dxa"/>
-              <w:left w:w="113.38582677165356" w:type="dxa"/>
-              <w:bottom w:w="113.38582677165356" w:type="dxa"/>
-              <w:right w:w="113.38582677165356" w:type="dxa"/>
-            </w:tcMar>
-            <w:vAlign w:val="center"/>
-          </w:tcPr>
-          <w:p>
-            <w:pPr>
-              <w:spacing w:before="0" w:line="240" w:lineRule="auto"/>
-              <w:ind w:left="108" w:right="121" w:firstLine="0"/>
-              <w:rPr>
-                <w:sz w:val="20"/>
-                <w:szCs w:val="20"/>
-              </w:rPr>
-            </w:pPr>
-            <w:r>
-              <w:rPr>
-                <w:sz w:val="20"/>
-                <w:szCs w:val="20"/>
-                <w:rtl w:val="0"/>
-              </w:rPr>
-              <w:t xml:space="preserve">Criação do documento de especificação de caso de uso (visualizar histórico)</w:t>
-            </w:r>
-          </w:p>
-        </w:tc>
-        <w:tc>
-          <w:tcPr>
-            <w:tcMar>
-              <w:top w:w="113.38582677165356" w:type="dxa"/>
-              <w:left w:w="113.38582677165356" w:type="dxa"/>
-              <w:bottom w:w="113.38582677165356" w:type="dxa"/>
-              <w:right w:w="113.38582677165356" w:type="dxa"/>
-            </w:tcMar>
-            <w:vAlign w:val="center"/>
-          </w:tcPr>
-          <w:p>
-            <w:pPr>
-              <w:spacing w:before="10" w:line="240" w:lineRule="auto"/>
-              <w:ind w:left="108" w:right="0" w:firstLine="0"/>
-              <w:jc w:val="center"/>
-              <w:rPr>
-                <w:b w:val="1"/>
-                <w:bCs w:val="1"/>
-                <w:sz w:val="20"/>
-                <w:szCs w:val="20"/>
-              </w:rPr>
-            </w:pPr>
-            <w:r>
-              <w:rPr>
-                <w:b w:val="1"/>
-                <w:bCs w:val="1"/>
-                <w:sz w:val="20"/>
-                <w:szCs w:val="20"/>
-                <w:rtl w:val="0"/>
-              </w:rPr>
-              <w:t xml:space="preserve">Arthur Ribeiro</w:t>
+              <w:t xml:space="preserve">Enzo Gomide, Guilherme Ayala, Dimitri Vieira, Gustavo Anisio e Arthur Ribeiro</w:t>
             </w:r>
           </w:p>
         </w:tc>
@@ -1379,7 +793,7 @@
     </w:p>
     <w:sdt>
       <w:sdtPr>
-        <w:id w:val="76514990"/>
+        <w:id w:val="-184505605"/>
         <w:docPartObj>
           <w:docPartGallery w:val="Table of Contents"/>
           <w:docPartUnique w:val="1"/>
@@ -1394,10 +808,19 @@
             <w:spacing w:line="240" w:lineRule="auto"/>
             <w:ind w:left="0" w:right="0" w:firstLine="0"/>
             <w:rPr>
+              <w:rFonts w:ascii="Arial" w:cs="Arial" w:eastAsia="Arial" w:hAnsi="Arial"/>
               <w:b w:val="1"/>
               <w:bCs w:val="1"/>
+              <w:i w:val="0"/>
+              <w:iCs w:val="0"/>
+              <w:smallCaps w:val="0"/>
+              <w:strike w:val="0"/>
               <w:color w:val="000000"/>
+              <w:sz w:val="22"/>
+              <w:szCs w:val="22"/>
               <w:u w:val="none"/>
+              <w:shd w:fill="auto" w:val="clear"/>
+              <w:vertAlign w:val="baseline"/>
             </w:rPr>
           </w:pPr>
           <w:r>
@@ -1425,7 +848,7 @@
               </w:rPr>
               <w:t xml:space="preserve">Especificação de Caso de Uso: Agendar Doação de Sangue</w:t>
               <w:tab/>
-              <w:t xml:space="preserve">3</w:t>
+              <w:t xml:space="preserve">4</w:t>
             </w:r>
           </w:hyperlink>
           <w:r>
@@ -1442,8 +865,19 @@
             <w:spacing w:line="240" w:lineRule="auto"/>
             <w:ind w:left="360" w:right="0" w:firstLine="0"/>
             <w:rPr>
+              <w:rFonts w:ascii="Arial" w:cs="Arial" w:eastAsia="Arial" w:hAnsi="Arial"/>
+              <w:b w:val="0"/>
+              <w:bCs w:val="0"/>
+              <w:i w:val="0"/>
+              <w:iCs w:val="0"/>
+              <w:smallCaps w:val="0"/>
+              <w:strike w:val="0"/>
               <w:color w:val="000000"/>
+              <w:sz w:val="22"/>
+              <w:szCs w:val="22"/>
               <w:u w:val="none"/>
+              <w:shd w:fill="auto" w:val="clear"/>
+              <w:vertAlign w:val="baseline"/>
             </w:rPr>
           </w:pPr>
           <w:hyperlink w:anchor="_8g180g82d6k7">
@@ -1466,7 +900,7 @@
               </w:rPr>
               <w:t xml:space="preserve">1. Descrição</w:t>
               <w:tab/>
-              <w:t xml:space="preserve">3</w:t>
+              <w:t xml:space="preserve">4</w:t>
             </w:r>
           </w:hyperlink>
           <w:r>
@@ -1483,8 +917,19 @@
             <w:spacing w:line="240" w:lineRule="auto"/>
             <w:ind w:left="360" w:right="0" w:firstLine="0"/>
             <w:rPr>
+              <w:rFonts w:ascii="Arial" w:cs="Arial" w:eastAsia="Arial" w:hAnsi="Arial"/>
+              <w:b w:val="0"/>
+              <w:bCs w:val="0"/>
+              <w:i w:val="0"/>
+              <w:iCs w:val="0"/>
+              <w:smallCaps w:val="0"/>
+              <w:strike w:val="0"/>
               <w:color w:val="000000"/>
+              <w:sz w:val="22"/>
+              <w:szCs w:val="22"/>
               <w:u w:val="none"/>
+              <w:shd w:fill="auto" w:val="clear"/>
+              <w:vertAlign w:val="baseline"/>
             </w:rPr>
           </w:pPr>
           <w:hyperlink w:anchor="_r0gvt15et164">
@@ -1507,7 +952,7 @@
               </w:rPr>
               <w:t xml:space="preserve">2. Pré-condições</w:t>
               <w:tab/>
-              <w:t xml:space="preserve">3</w:t>
+              <w:t xml:space="preserve">4</w:t>
             </w:r>
           </w:hyperlink>
           <w:r>
@@ -1524,8 +969,19 @@
             <w:spacing w:line="240" w:lineRule="auto"/>
             <w:ind w:left="360" w:right="0" w:firstLine="0"/>
             <w:rPr>
+              <w:rFonts w:ascii="Arial" w:cs="Arial" w:eastAsia="Arial" w:hAnsi="Arial"/>
+              <w:b w:val="0"/>
+              <w:bCs w:val="0"/>
+              <w:i w:val="0"/>
+              <w:iCs w:val="0"/>
+              <w:smallCaps w:val="0"/>
+              <w:strike w:val="0"/>
               <w:color w:val="000000"/>
+              <w:sz w:val="22"/>
+              <w:szCs w:val="22"/>
               <w:u w:val="none"/>
+              <w:shd w:fill="auto" w:val="clear"/>
+              <w:vertAlign w:val="baseline"/>
             </w:rPr>
           </w:pPr>
           <w:hyperlink w:anchor="_jw1hshvycuti">
@@ -1548,7 +1004,7 @@
               </w:rPr>
               <w:t xml:space="preserve">3. Fluxo de Eventos</w:t>
               <w:tab/>
-              <w:t xml:space="preserve">3</w:t>
+              <w:t xml:space="preserve">4</w:t>
             </w:r>
           </w:hyperlink>
           <w:r>
@@ -1565,8 +1021,19 @@
             <w:spacing w:line="240" w:lineRule="auto"/>
             <w:ind w:left="720" w:right="0" w:firstLine="0"/>
             <w:rPr>
+              <w:rFonts w:ascii="Arial" w:cs="Arial" w:eastAsia="Arial" w:hAnsi="Arial"/>
+              <w:b w:val="0"/>
+              <w:bCs w:val="0"/>
+              <w:i w:val="0"/>
+              <w:iCs w:val="0"/>
+              <w:smallCaps w:val="0"/>
+              <w:strike w:val="0"/>
               <w:color w:val="000000"/>
+              <w:sz w:val="22"/>
+              <w:szCs w:val="22"/>
               <w:u w:val="none"/>
+              <w:shd w:fill="auto" w:val="clear"/>
+              <w:vertAlign w:val="baseline"/>
             </w:rPr>
           </w:pPr>
           <w:hyperlink w:anchor="_80khtio6tjsf">
@@ -1589,7 +1056,7 @@
               </w:rPr>
               <w:t xml:space="preserve">3.1. Fluxo Básico</w:t>
               <w:tab/>
-              <w:t xml:space="preserve">3</w:t>
+              <w:t xml:space="preserve">4</w:t>
             </w:r>
           </w:hyperlink>
           <w:r>
@@ -1606,8 +1073,19 @@
             <w:spacing w:line="240" w:lineRule="auto"/>
             <w:ind w:left="720" w:right="0" w:firstLine="0"/>
             <w:rPr>
+              <w:rFonts w:ascii="Arial" w:cs="Arial" w:eastAsia="Arial" w:hAnsi="Arial"/>
+              <w:b w:val="0"/>
+              <w:bCs w:val="0"/>
+              <w:i w:val="0"/>
+              <w:iCs w:val="0"/>
+              <w:smallCaps w:val="0"/>
+              <w:strike w:val="0"/>
               <w:color w:val="000000"/>
+              <w:sz w:val="22"/>
+              <w:szCs w:val="22"/>
               <w:u w:val="none"/>
+              <w:shd w:fill="auto" w:val="clear"/>
+              <w:vertAlign w:val="baseline"/>
             </w:rPr>
           </w:pPr>
           <w:hyperlink w:anchor="_9ir9b9lfolqe">
@@ -1630,7 +1108,7 @@
               </w:rPr>
               <w:t xml:space="preserve">3.2. Subfluxos</w:t>
               <w:tab/>
-              <w:t xml:space="preserve">3</w:t>
+              <w:t xml:space="preserve">4</w:t>
             </w:r>
           </w:hyperlink>
           <w:r>
@@ -1647,8 +1125,19 @@
             <w:spacing w:line="240" w:lineRule="auto"/>
             <w:ind w:left="1080" w:right="0" w:firstLine="0"/>
             <w:rPr>
+              <w:rFonts w:ascii="Arial" w:cs="Arial" w:eastAsia="Arial" w:hAnsi="Arial"/>
+              <w:b w:val="0"/>
+              <w:bCs w:val="0"/>
+              <w:i w:val="0"/>
+              <w:iCs w:val="0"/>
+              <w:smallCaps w:val="0"/>
+              <w:strike w:val="0"/>
               <w:color w:val="000000"/>
+              <w:sz w:val="22"/>
+              <w:szCs w:val="22"/>
               <w:u w:val="none"/>
+              <w:shd w:fill="auto" w:val="clear"/>
+              <w:vertAlign w:val="baseline"/>
             </w:rPr>
           </w:pPr>
           <w:hyperlink w:anchor="_m5pk5463yx2r">
@@ -1669,9 +1158,9 @@
                 <w:vertAlign w:val="baseline"/>
                 <w:rtl w:val="0"/>
               </w:rPr>
-              <w:t xml:space="preserve">3.2.1. (A01) – Hemocentro sem vagas no horário selecionado</w:t>
+              <w:t xml:space="preserve">3.2.1. (S01) – Hemocentro sem vagas no horário selecionado</w:t>
               <w:tab/>
-              <w:t xml:space="preserve">3</w:t>
+              <w:t xml:space="preserve">4</w:t>
             </w:r>
           </w:hyperlink>
           <w:r>
@@ -1688,8 +1177,19 @@
             <w:spacing w:line="240" w:lineRule="auto"/>
             <w:ind w:left="720" w:right="0" w:firstLine="0"/>
             <w:rPr>
+              <w:rFonts w:ascii="Arial" w:cs="Arial" w:eastAsia="Arial" w:hAnsi="Arial"/>
+              <w:b w:val="0"/>
+              <w:bCs w:val="0"/>
+              <w:i w:val="0"/>
+              <w:iCs w:val="0"/>
+              <w:smallCaps w:val="0"/>
+              <w:strike w:val="0"/>
               <w:color w:val="000000"/>
+              <w:sz w:val="22"/>
+              <w:szCs w:val="22"/>
               <w:u w:val="none"/>
+              <w:shd w:fill="auto" w:val="clear"/>
+              <w:vertAlign w:val="baseline"/>
             </w:rPr>
           </w:pPr>
           <w:hyperlink w:anchor="_2iwwengr7bwn">
@@ -1712,7 +1212,7 @@
               </w:rPr>
               <w:t xml:space="preserve">3.3. Fluxos Alternativos</w:t>
               <w:tab/>
-              <w:t xml:space="preserve">3</w:t>
+              <w:t xml:space="preserve">4</w:t>
             </w:r>
           </w:hyperlink>
           <w:r>
@@ -1729,20 +1229,42 @@
             <w:spacing w:line="240" w:lineRule="auto"/>
             <w:ind w:left="1080" w:right="0" w:firstLine="0"/>
             <w:rPr>
+              <w:rFonts w:ascii="Arial" w:cs="Arial" w:eastAsia="Arial" w:hAnsi="Arial"/>
+              <w:b w:val="0"/>
+              <w:bCs w:val="0"/>
+              <w:i w:val="0"/>
+              <w:iCs w:val="0"/>
+              <w:smallCaps w:val="0"/>
+              <w:strike w:val="0"/>
               <w:color w:val="000000"/>
+              <w:sz w:val="22"/>
+              <w:szCs w:val="22"/>
               <w:u w:val="none"/>
+              <w:shd w:fill="auto" w:val="clear"/>
+              <w:vertAlign w:val="baseline"/>
             </w:rPr>
           </w:pPr>
           <w:hyperlink w:anchor="_4ai5f2h00ap1">
             <w:r>
               <w:rPr>
+                <w:rFonts w:ascii="Arial" w:cs="Arial" w:eastAsia="Arial" w:hAnsi="Arial"/>
+                <w:b w:val="0"/>
+                <w:bCs w:val="0"/>
+                <w:i w:val="0"/>
+                <w:iCs w:val="0"/>
+                <w:smallCaps w:val="0"/>
+                <w:strike w:val="0"/>
                 <w:color w:val="000000"/>
+                <w:sz w:val="22"/>
+                <w:szCs w:val="22"/>
                 <w:u w:val="none"/>
+                <w:shd w:fill="auto" w:val="clear"/>
+                <w:vertAlign w:val="baseline"/>
                 <w:rtl w:val="0"/>
               </w:rPr>
               <w:t xml:space="preserve">3.3.1. (A01) – Doador Inapto por Intervalo de Tempo</w:t>
               <w:tab/>
-              <w:t xml:space="preserve">3</w:t>
+              <w:t xml:space="preserve">4</w:t>
             </w:r>
           </w:hyperlink>
           <w:r>
@@ -1759,20 +1281,42 @@
             <w:spacing w:line="240" w:lineRule="auto"/>
             <w:ind w:left="720" w:right="0" w:firstLine="0"/>
             <w:rPr>
+              <w:rFonts w:ascii="Arial" w:cs="Arial" w:eastAsia="Arial" w:hAnsi="Arial"/>
+              <w:b w:val="0"/>
+              <w:bCs w:val="0"/>
+              <w:i w:val="0"/>
+              <w:iCs w:val="0"/>
+              <w:smallCaps w:val="0"/>
+              <w:strike w:val="0"/>
               <w:color w:val="000000"/>
+              <w:sz w:val="22"/>
+              <w:szCs w:val="22"/>
               <w:u w:val="none"/>
+              <w:shd w:fill="auto" w:val="clear"/>
+              <w:vertAlign w:val="baseline"/>
             </w:rPr>
           </w:pPr>
           <w:hyperlink w:anchor="_q4paci510djp">
             <w:r>
               <w:rPr>
+                <w:rFonts w:ascii="Arial" w:cs="Arial" w:eastAsia="Arial" w:hAnsi="Arial"/>
+                <w:b w:val="0"/>
+                <w:bCs w:val="0"/>
+                <w:i w:val="0"/>
+                <w:iCs w:val="0"/>
+                <w:smallCaps w:val="0"/>
+                <w:strike w:val="0"/>
                 <w:color w:val="000000"/>
+                <w:sz w:val="22"/>
+                <w:szCs w:val="22"/>
                 <w:u w:val="none"/>
+                <w:shd w:fill="auto" w:val="clear"/>
+                <w:vertAlign w:val="baseline"/>
                 <w:rtl w:val="0"/>
               </w:rPr>
               <w:t xml:space="preserve">3.4. Exceções</w:t>
               <w:tab/>
-              <w:t xml:space="preserve">4</w:t>
+              <w:t xml:space="preserve">5</w:t>
             </w:r>
           </w:hyperlink>
           <w:r>
@@ -1789,20 +1333,42 @@
             <w:spacing w:line="240" w:lineRule="auto"/>
             <w:ind w:left="1080" w:right="0" w:firstLine="0"/>
             <w:rPr>
+              <w:rFonts w:ascii="Arial" w:cs="Arial" w:eastAsia="Arial" w:hAnsi="Arial"/>
+              <w:b w:val="0"/>
+              <w:bCs w:val="0"/>
+              <w:i w:val="0"/>
+              <w:iCs w:val="0"/>
+              <w:smallCaps w:val="0"/>
+              <w:strike w:val="0"/>
               <w:color w:val="000000"/>
+              <w:sz w:val="22"/>
+              <w:szCs w:val="22"/>
               <w:u w:val="none"/>
+              <w:shd w:fill="auto" w:val="clear"/>
+              <w:vertAlign w:val="baseline"/>
             </w:rPr>
           </w:pPr>
           <w:hyperlink w:anchor="_5u564nl26ohi">
             <w:r>
               <w:rPr>
+                <w:rFonts w:ascii="Arial" w:cs="Arial" w:eastAsia="Arial" w:hAnsi="Arial"/>
+                <w:b w:val="0"/>
+                <w:bCs w:val="0"/>
+                <w:i w:val="0"/>
+                <w:iCs w:val="0"/>
+                <w:smallCaps w:val="0"/>
+                <w:strike w:val="0"/>
                 <w:color w:val="000000"/>
+                <w:sz w:val="22"/>
+                <w:szCs w:val="22"/>
                 <w:u w:val="none"/>
+                <w:shd w:fill="auto" w:val="clear"/>
+                <w:vertAlign w:val="baseline"/>
                 <w:rtl w:val="0"/>
               </w:rPr>
               <w:t xml:space="preserve">3.4.1. (E01) – Horário Indisponível</w:t>
               <w:tab/>
-              <w:t xml:space="preserve">4</w:t>
+              <w:t xml:space="preserve">5</w:t>
             </w:r>
           </w:hyperlink>
           <w:r>
@@ -1819,20 +1385,42 @@
             <w:spacing w:line="240" w:lineRule="auto"/>
             <w:ind w:left="360" w:right="0" w:firstLine="0"/>
             <w:rPr>
+              <w:rFonts w:ascii="Arial" w:cs="Arial" w:eastAsia="Arial" w:hAnsi="Arial"/>
+              <w:b w:val="0"/>
+              <w:bCs w:val="0"/>
+              <w:i w:val="0"/>
+              <w:iCs w:val="0"/>
+              <w:smallCaps w:val="0"/>
+              <w:strike w:val="0"/>
               <w:color w:val="000000"/>
+              <w:sz w:val="22"/>
+              <w:szCs w:val="22"/>
               <w:u w:val="none"/>
+              <w:shd w:fill="auto" w:val="clear"/>
+              <w:vertAlign w:val="baseline"/>
             </w:rPr>
           </w:pPr>
           <w:hyperlink w:anchor="_go3lhyiq6cb4">
             <w:r>
               <w:rPr>
+                <w:rFonts w:ascii="Arial" w:cs="Arial" w:eastAsia="Arial" w:hAnsi="Arial"/>
+                <w:b w:val="0"/>
+                <w:bCs w:val="0"/>
+                <w:i w:val="0"/>
+                <w:iCs w:val="0"/>
+                <w:smallCaps w:val="0"/>
+                <w:strike w:val="0"/>
                 <w:color w:val="000000"/>
+                <w:sz w:val="22"/>
+                <w:szCs w:val="22"/>
                 <w:u w:val="none"/>
+                <w:shd w:fill="auto" w:val="clear"/>
+                <w:vertAlign w:val="baseline"/>
                 <w:rtl w:val="0"/>
               </w:rPr>
               <w:t xml:space="preserve">4. Pós-condições</w:t>
               <w:tab/>
-              <w:t xml:space="preserve">4</w:t>
+              <w:t xml:space="preserve">5</w:t>
             </w:r>
           </w:hyperlink>
           <w:r>
@@ -1849,20 +1437,42 @@
             <w:spacing w:line="240" w:lineRule="auto"/>
             <w:ind w:left="360" w:right="0" w:firstLine="0"/>
             <w:rPr>
+              <w:rFonts w:ascii="Arial" w:cs="Arial" w:eastAsia="Arial" w:hAnsi="Arial"/>
+              <w:b w:val="0"/>
+              <w:bCs w:val="0"/>
+              <w:i w:val="0"/>
+              <w:iCs w:val="0"/>
+              <w:smallCaps w:val="0"/>
+              <w:strike w:val="0"/>
               <w:color w:val="000000"/>
+              <w:sz w:val="22"/>
+              <w:szCs w:val="22"/>
               <w:u w:val="none"/>
+              <w:shd w:fill="auto" w:val="clear"/>
+              <w:vertAlign w:val="baseline"/>
             </w:rPr>
           </w:pPr>
           <w:hyperlink w:anchor="_jvrgys2dves8">
             <w:r>
               <w:rPr>
+                <w:rFonts w:ascii="Arial" w:cs="Arial" w:eastAsia="Arial" w:hAnsi="Arial"/>
+                <w:b w:val="0"/>
+                <w:bCs w:val="0"/>
+                <w:i w:val="0"/>
+                <w:iCs w:val="0"/>
+                <w:smallCaps w:val="0"/>
+                <w:strike w:val="0"/>
                 <w:color w:val="000000"/>
+                <w:sz w:val="22"/>
+                <w:szCs w:val="22"/>
                 <w:u w:val="none"/>
+                <w:shd w:fill="auto" w:val="clear"/>
+                <w:vertAlign w:val="baseline"/>
                 <w:rtl w:val="0"/>
               </w:rPr>
               <w:t xml:space="preserve">5. Requisitos Especiais</w:t>
               <w:tab/>
-              <w:t xml:space="preserve">4</w:t>
+              <w:t xml:space="preserve">5</w:t>
             </w:r>
           </w:hyperlink>
           <w:r>
@@ -1879,20 +1489,42 @@
             <w:spacing w:line="240" w:lineRule="auto"/>
             <w:ind w:left="360" w:right="0" w:firstLine="0"/>
             <w:rPr>
+              <w:rFonts w:ascii="Arial" w:cs="Arial" w:eastAsia="Arial" w:hAnsi="Arial"/>
+              <w:b w:val="0"/>
+              <w:bCs w:val="0"/>
+              <w:i w:val="0"/>
+              <w:iCs w:val="0"/>
+              <w:smallCaps w:val="0"/>
+              <w:strike w:val="0"/>
               <w:color w:val="000000"/>
+              <w:sz w:val="22"/>
+              <w:szCs w:val="22"/>
               <w:u w:val="none"/>
+              <w:shd w:fill="auto" w:val="clear"/>
+              <w:vertAlign w:val="baseline"/>
             </w:rPr>
           </w:pPr>
           <w:hyperlink w:anchor="_xy59xut616ss">
             <w:r>
               <w:rPr>
+                <w:rFonts w:ascii="Arial" w:cs="Arial" w:eastAsia="Arial" w:hAnsi="Arial"/>
+                <w:b w:val="0"/>
+                <w:bCs w:val="0"/>
+                <w:i w:val="0"/>
+                <w:iCs w:val="0"/>
+                <w:smallCaps w:val="0"/>
+                <w:strike w:val="0"/>
                 <w:color w:val="000000"/>
+                <w:sz w:val="22"/>
+                <w:szCs w:val="22"/>
                 <w:u w:val="none"/>
+                <w:shd w:fill="auto" w:val="clear"/>
+                <w:vertAlign w:val="baseline"/>
                 <w:rtl w:val="0"/>
               </w:rPr>
               <w:t xml:space="preserve">6. Regras de negócio específicas</w:t>
               <w:tab/>
-              <w:t xml:space="preserve">4</w:t>
+              <w:t xml:space="preserve">5</w:t>
             </w:r>
           </w:hyperlink>
           <w:r>
@@ -1909,20 +1541,42 @@
             <w:spacing w:line="240" w:lineRule="auto"/>
             <w:ind w:left="360" w:right="0" w:firstLine="0"/>
             <w:rPr>
+              <w:rFonts w:ascii="Arial" w:cs="Arial" w:eastAsia="Arial" w:hAnsi="Arial"/>
+              <w:b w:val="0"/>
+              <w:bCs w:val="0"/>
+              <w:i w:val="0"/>
+              <w:iCs w:val="0"/>
+              <w:smallCaps w:val="0"/>
+              <w:strike w:val="0"/>
               <w:color w:val="000000"/>
+              <w:sz w:val="22"/>
+              <w:szCs w:val="22"/>
               <w:u w:val="none"/>
+              <w:shd w:fill="auto" w:val="clear"/>
+              <w:vertAlign w:val="baseline"/>
             </w:rPr>
           </w:pPr>
           <w:hyperlink w:anchor="_dkkb3jnacvjp">
             <w:r>
               <w:rPr>
+                <w:rFonts w:ascii="Arial" w:cs="Arial" w:eastAsia="Arial" w:hAnsi="Arial"/>
+                <w:b w:val="0"/>
+                <w:bCs w:val="0"/>
+                <w:i w:val="0"/>
+                <w:iCs w:val="0"/>
+                <w:smallCaps w:val="0"/>
+                <w:strike w:val="0"/>
                 <w:color w:val="000000"/>
+                <w:sz w:val="22"/>
+                <w:szCs w:val="22"/>
                 <w:u w:val="none"/>
+                <w:shd w:fill="auto" w:val="clear"/>
+                <w:vertAlign w:val="baseline"/>
                 <w:rtl w:val="0"/>
               </w:rPr>
               <w:t xml:space="preserve">7. Detalhamento das Interfaces com Usuário</w:t>
               <w:tab/>
-              <w:t xml:space="preserve">5</w:t>
+              <w:t xml:space="preserve">6</w:t>
             </w:r>
           </w:hyperlink>
           <w:r>
@@ -1939,20 +1593,42 @@
             <w:spacing w:line="240" w:lineRule="auto"/>
             <w:ind w:left="720" w:right="0" w:firstLine="0"/>
             <w:rPr>
+              <w:rFonts w:ascii="Arial" w:cs="Arial" w:eastAsia="Arial" w:hAnsi="Arial"/>
+              <w:b w:val="0"/>
+              <w:bCs w:val="0"/>
+              <w:i w:val="0"/>
+              <w:iCs w:val="0"/>
+              <w:smallCaps w:val="0"/>
+              <w:strike w:val="0"/>
               <w:color w:val="000000"/>
+              <w:sz w:val="22"/>
+              <w:szCs w:val="22"/>
               <w:u w:val="none"/>
+              <w:shd w:fill="auto" w:val="clear"/>
+              <w:vertAlign w:val="baseline"/>
             </w:rPr>
           </w:pPr>
           <w:hyperlink w:anchor="_m4csitg2ay2v">
             <w:r>
               <w:rPr>
+                <w:rFonts w:ascii="Arial" w:cs="Arial" w:eastAsia="Arial" w:hAnsi="Arial"/>
+                <w:b w:val="0"/>
+                <w:bCs w:val="0"/>
+                <w:i w:val="0"/>
+                <w:iCs w:val="0"/>
+                <w:smallCaps w:val="0"/>
+                <w:strike w:val="0"/>
                 <w:color w:val="000000"/>
+                <w:sz w:val="22"/>
+                <w:szCs w:val="22"/>
                 <w:u w:val="none"/>
+                <w:shd w:fill="auto" w:val="clear"/>
+                <w:vertAlign w:val="baseline"/>
                 <w:rtl w:val="0"/>
               </w:rPr>
               <w:t xml:space="preserve">7.1. (I01) - Tela de Agendamento de Doação</w:t>
               <w:tab/>
-              <w:t xml:space="preserve">5</w:t>
+              <w:t xml:space="preserve">6</w:t>
             </w:r>
           </w:hyperlink>
           <w:r>
@@ -1969,20 +1645,42 @@
             <w:spacing w:line="240" w:lineRule="auto"/>
             <w:ind w:left="360" w:right="0" w:firstLine="0"/>
             <w:rPr>
+              <w:rFonts w:ascii="Arial" w:cs="Arial" w:eastAsia="Arial" w:hAnsi="Arial"/>
+              <w:b w:val="0"/>
+              <w:bCs w:val="0"/>
+              <w:i w:val="0"/>
+              <w:iCs w:val="0"/>
+              <w:smallCaps w:val="0"/>
+              <w:strike w:val="0"/>
               <w:color w:val="000000"/>
+              <w:sz w:val="22"/>
+              <w:szCs w:val="22"/>
               <w:u w:val="none"/>
+              <w:shd w:fill="auto" w:val="clear"/>
+              <w:vertAlign w:val="baseline"/>
             </w:rPr>
           </w:pPr>
           <w:hyperlink w:anchor="_vlcgd7pgm1ll">
             <w:r>
               <w:rPr>
+                <w:rFonts w:ascii="Arial" w:cs="Arial" w:eastAsia="Arial" w:hAnsi="Arial"/>
+                <w:b w:val="0"/>
+                <w:bCs w:val="0"/>
+                <w:i w:val="0"/>
+                <w:iCs w:val="0"/>
+                <w:smallCaps w:val="0"/>
+                <w:strike w:val="0"/>
                 <w:color w:val="000000"/>
+                <w:sz w:val="22"/>
+                <w:szCs w:val="22"/>
                 <w:u w:val="none"/>
+                <w:shd w:fill="auto" w:val="clear"/>
+                <w:vertAlign w:val="baseline"/>
                 <w:rtl w:val="0"/>
               </w:rPr>
               <w:t xml:space="preserve">8. Demais Interfaces</w:t>
               <w:tab/>
-              <w:t xml:space="preserve">6</w:t>
+              <w:t xml:space="preserve">7</w:t>
             </w:r>
           </w:hyperlink>
           <w:r>
@@ -1999,24 +1697,42 @@
             <w:spacing w:line="240" w:lineRule="auto"/>
             <w:ind w:left="0" w:right="0" w:firstLine="0"/>
             <w:rPr>
+              <w:rFonts w:ascii="Arial" w:cs="Arial" w:eastAsia="Arial" w:hAnsi="Arial"/>
               <w:b w:val="1"/>
               <w:bCs w:val="1"/>
+              <w:i w:val="0"/>
+              <w:iCs w:val="0"/>
+              <w:smallCaps w:val="0"/>
+              <w:strike w:val="0"/>
               <w:color w:val="000000"/>
+              <w:sz w:val="22"/>
+              <w:szCs w:val="22"/>
               <w:u w:val="none"/>
+              <w:shd w:fill="auto" w:val="clear"/>
+              <w:vertAlign w:val="baseline"/>
             </w:rPr>
           </w:pPr>
           <w:hyperlink w:anchor="_qmm74srld0h3">
             <w:r>
               <w:rPr>
+                <w:rFonts w:ascii="Arial" w:cs="Arial" w:eastAsia="Arial" w:hAnsi="Arial"/>
                 <w:b w:val="1"/>
                 <w:bCs w:val="1"/>
+                <w:i w:val="0"/>
+                <w:iCs w:val="0"/>
+                <w:smallCaps w:val="0"/>
+                <w:strike w:val="0"/>
                 <w:color w:val="000000"/>
+                <w:sz w:val="22"/>
+                <w:szCs w:val="22"/>
                 <w:u w:val="none"/>
+                <w:shd w:fill="auto" w:val="clear"/>
+                <w:vertAlign w:val="baseline"/>
                 <w:rtl w:val="0"/>
               </w:rPr>
               <w:t xml:space="preserve">Especificação de Caso de Uso: Cadastro e Login</w:t>
               <w:tab/>
-              <w:t xml:space="preserve">7</w:t>
+              <w:t xml:space="preserve">8</w:t>
             </w:r>
           </w:hyperlink>
           <w:r>
@@ -2033,20 +1749,42 @@
             <w:spacing w:line="240" w:lineRule="auto"/>
             <w:ind w:left="360" w:right="0" w:firstLine="0"/>
             <w:rPr>
+              <w:rFonts w:ascii="Arial" w:cs="Arial" w:eastAsia="Arial" w:hAnsi="Arial"/>
+              <w:b w:val="0"/>
+              <w:bCs w:val="0"/>
+              <w:i w:val="0"/>
+              <w:iCs w:val="0"/>
+              <w:smallCaps w:val="0"/>
+              <w:strike w:val="0"/>
               <w:color w:val="000000"/>
+              <w:sz w:val="22"/>
+              <w:szCs w:val="22"/>
               <w:u w:val="none"/>
+              <w:shd w:fill="auto" w:val="clear"/>
+              <w:vertAlign w:val="baseline"/>
             </w:rPr>
           </w:pPr>
           <w:hyperlink w:anchor="_o54l5qc7pgk2">
             <w:r>
               <w:rPr>
+                <w:rFonts w:ascii="Arial" w:cs="Arial" w:eastAsia="Arial" w:hAnsi="Arial"/>
+                <w:b w:val="0"/>
+                <w:bCs w:val="0"/>
+                <w:i w:val="0"/>
+                <w:iCs w:val="0"/>
+                <w:smallCaps w:val="0"/>
+                <w:strike w:val="0"/>
                 <w:color w:val="000000"/>
+                <w:sz w:val="22"/>
+                <w:szCs w:val="22"/>
                 <w:u w:val="none"/>
+                <w:shd w:fill="auto" w:val="clear"/>
+                <w:vertAlign w:val="baseline"/>
                 <w:rtl w:val="0"/>
               </w:rPr>
               <w:t xml:space="preserve">1. Descrição</w:t>
               <w:tab/>
-              <w:t xml:space="preserve">7</w:t>
+              <w:t xml:space="preserve">8</w:t>
             </w:r>
           </w:hyperlink>
           <w:r>
@@ -2063,20 +1801,42 @@
             <w:spacing w:line="240" w:lineRule="auto"/>
             <w:ind w:left="360" w:right="0" w:firstLine="0"/>
             <w:rPr>
+              <w:rFonts w:ascii="Arial" w:cs="Arial" w:eastAsia="Arial" w:hAnsi="Arial"/>
+              <w:b w:val="0"/>
+              <w:bCs w:val="0"/>
+              <w:i w:val="0"/>
+              <w:iCs w:val="0"/>
+              <w:smallCaps w:val="0"/>
+              <w:strike w:val="0"/>
               <w:color w:val="000000"/>
+              <w:sz w:val="22"/>
+              <w:szCs w:val="22"/>
               <w:u w:val="none"/>
+              <w:shd w:fill="auto" w:val="clear"/>
+              <w:vertAlign w:val="baseline"/>
             </w:rPr>
           </w:pPr>
           <w:hyperlink w:anchor="_uzo0ewjvjmsp">
             <w:r>
               <w:rPr>
+                <w:rFonts w:ascii="Arial" w:cs="Arial" w:eastAsia="Arial" w:hAnsi="Arial"/>
+                <w:b w:val="0"/>
+                <w:bCs w:val="0"/>
+                <w:i w:val="0"/>
+                <w:iCs w:val="0"/>
+                <w:smallCaps w:val="0"/>
+                <w:strike w:val="0"/>
                 <w:color w:val="000000"/>
+                <w:sz w:val="22"/>
+                <w:szCs w:val="22"/>
                 <w:u w:val="none"/>
+                <w:shd w:fill="auto" w:val="clear"/>
+                <w:vertAlign w:val="baseline"/>
                 <w:rtl w:val="0"/>
               </w:rPr>
               <w:t xml:space="preserve">2. Pré-condições</w:t>
               <w:tab/>
-              <w:t xml:space="preserve">7</w:t>
+              <w:t xml:space="preserve">8</w:t>
             </w:r>
           </w:hyperlink>
           <w:r>
@@ -2093,20 +1853,42 @@
             <w:spacing w:line="240" w:lineRule="auto"/>
             <w:ind w:left="360" w:right="0" w:firstLine="0"/>
             <w:rPr>
+              <w:rFonts w:ascii="Arial" w:cs="Arial" w:eastAsia="Arial" w:hAnsi="Arial"/>
+              <w:b w:val="0"/>
+              <w:bCs w:val="0"/>
+              <w:i w:val="0"/>
+              <w:iCs w:val="0"/>
+              <w:smallCaps w:val="0"/>
+              <w:strike w:val="0"/>
               <w:color w:val="000000"/>
+              <w:sz w:val="22"/>
+              <w:szCs w:val="22"/>
               <w:u w:val="none"/>
+              <w:shd w:fill="auto" w:val="clear"/>
+              <w:vertAlign w:val="baseline"/>
             </w:rPr>
           </w:pPr>
           <w:hyperlink w:anchor="_xvivnc9o36r6">
             <w:r>
               <w:rPr>
+                <w:rFonts w:ascii="Arial" w:cs="Arial" w:eastAsia="Arial" w:hAnsi="Arial"/>
+                <w:b w:val="0"/>
+                <w:bCs w:val="0"/>
+                <w:i w:val="0"/>
+                <w:iCs w:val="0"/>
+                <w:smallCaps w:val="0"/>
+                <w:strike w:val="0"/>
                 <w:color w:val="000000"/>
+                <w:sz w:val="22"/>
+                <w:szCs w:val="22"/>
                 <w:u w:val="none"/>
+                <w:shd w:fill="auto" w:val="clear"/>
+                <w:vertAlign w:val="baseline"/>
                 <w:rtl w:val="0"/>
               </w:rPr>
               <w:t xml:space="preserve">3. Fluxo de Eventos</w:t>
               <w:tab/>
-              <w:t xml:space="preserve">7</w:t>
+              <w:t xml:space="preserve">8</w:t>
             </w:r>
           </w:hyperlink>
           <w:r>
@@ -2123,8 +1905,19 @@
             <w:spacing w:line="240" w:lineRule="auto"/>
             <w:ind w:left="720" w:right="0" w:firstLine="0"/>
             <w:rPr>
+              <w:rFonts w:ascii="Arial" w:cs="Arial" w:eastAsia="Arial" w:hAnsi="Arial"/>
+              <w:b w:val="0"/>
+              <w:bCs w:val="0"/>
+              <w:i w:val="0"/>
+              <w:iCs w:val="0"/>
+              <w:smallCaps w:val="0"/>
+              <w:strike w:val="0"/>
               <w:color w:val="000000"/>
+              <w:sz w:val="22"/>
+              <w:szCs w:val="22"/>
               <w:u w:val="none"/>
+              <w:shd w:fill="auto" w:val="clear"/>
+              <w:vertAlign w:val="baseline"/>
             </w:rPr>
           </w:pPr>
           <w:hyperlink w:anchor="_mpjr387jh1vg">
@@ -2147,7 +1940,7 @@
               </w:rPr>
               <w:t xml:space="preserve">3.1. Fluxo Básico</w:t>
               <w:tab/>
-              <w:t xml:space="preserve">7</w:t>
+              <w:t xml:space="preserve">8</w:t>
             </w:r>
           </w:hyperlink>
           <w:r>
@@ -2164,8 +1957,19 @@
             <w:spacing w:line="240" w:lineRule="auto"/>
             <w:ind w:left="720" w:right="0" w:firstLine="0"/>
             <w:rPr>
+              <w:rFonts w:ascii="Arial" w:cs="Arial" w:eastAsia="Arial" w:hAnsi="Arial"/>
+              <w:b w:val="0"/>
+              <w:bCs w:val="0"/>
+              <w:i w:val="0"/>
+              <w:iCs w:val="0"/>
+              <w:smallCaps w:val="0"/>
+              <w:strike w:val="0"/>
               <w:color w:val="000000"/>
+              <w:sz w:val="22"/>
+              <w:szCs w:val="22"/>
               <w:u w:val="none"/>
+              <w:shd w:fill="auto" w:val="clear"/>
+              <w:vertAlign w:val="baseline"/>
             </w:rPr>
           </w:pPr>
           <w:hyperlink w:anchor="_rrhdggqx7zcf">
@@ -2188,7 +1992,7 @@
               </w:rPr>
               <w:t xml:space="preserve">3.2. Subfluxos</w:t>
               <w:tab/>
-              <w:t xml:space="preserve">7</w:t>
+              <w:t xml:space="preserve">8</w:t>
             </w:r>
           </w:hyperlink>
           <w:r>
@@ -2205,20 +2009,42 @@
             <w:spacing w:line="240" w:lineRule="auto"/>
             <w:ind w:left="1080" w:right="0" w:firstLine="0"/>
             <w:rPr>
+              <w:rFonts w:ascii="Arial" w:cs="Arial" w:eastAsia="Arial" w:hAnsi="Arial"/>
+              <w:b w:val="0"/>
+              <w:bCs w:val="0"/>
+              <w:i w:val="0"/>
+              <w:iCs w:val="0"/>
+              <w:smallCaps w:val="0"/>
+              <w:strike w:val="0"/>
               <w:color w:val="000000"/>
+              <w:sz w:val="22"/>
+              <w:szCs w:val="22"/>
               <w:u w:val="none"/>
+              <w:shd w:fill="auto" w:val="clear"/>
+              <w:vertAlign w:val="baseline"/>
             </w:rPr>
           </w:pPr>
           <w:hyperlink w:anchor="_gh7t9x865n17">
             <w:r>
               <w:rPr>
+                <w:rFonts w:ascii="Arial" w:cs="Arial" w:eastAsia="Arial" w:hAnsi="Arial"/>
+                <w:b w:val="0"/>
+                <w:bCs w:val="0"/>
+                <w:i w:val="0"/>
+                <w:iCs w:val="0"/>
+                <w:smallCaps w:val="0"/>
+                <w:strike w:val="0"/>
                 <w:color w:val="000000"/>
+                <w:sz w:val="22"/>
+                <w:szCs w:val="22"/>
                 <w:u w:val="none"/>
-                <w:rtl w:val="0"/>
-              </w:rPr>
-              <w:t xml:space="preserve">3.2.1. (S01) – Validação de Força da Senha</w:t>
+                <w:shd w:fill="auto" w:val="clear"/>
+                <w:vertAlign w:val="baseline"/>
+                <w:rtl w:val="0"/>
+              </w:rPr>
+              <w:t xml:space="preserve">3.2.1. (S02) – Validação de Força da Senha</w:t>
               <w:tab/>
-              <w:t xml:space="preserve">7</w:t>
+              <w:t xml:space="preserve">8</w:t>
             </w:r>
           </w:hyperlink>
           <w:r>
@@ -2235,20 +2061,42 @@
             <w:spacing w:line="240" w:lineRule="auto"/>
             <w:ind w:left="720" w:right="0" w:firstLine="0"/>
             <w:rPr>
+              <w:rFonts w:ascii="Arial" w:cs="Arial" w:eastAsia="Arial" w:hAnsi="Arial"/>
+              <w:b w:val="0"/>
+              <w:bCs w:val="0"/>
+              <w:i w:val="0"/>
+              <w:iCs w:val="0"/>
+              <w:smallCaps w:val="0"/>
+              <w:strike w:val="0"/>
               <w:color w:val="000000"/>
+              <w:sz w:val="22"/>
+              <w:szCs w:val="22"/>
               <w:u w:val="none"/>
+              <w:shd w:fill="auto" w:val="clear"/>
+              <w:vertAlign w:val="baseline"/>
             </w:rPr>
           </w:pPr>
           <w:hyperlink w:anchor="_u5q3swk42q9n">
             <w:r>
               <w:rPr>
+                <w:rFonts w:ascii="Arial" w:cs="Arial" w:eastAsia="Arial" w:hAnsi="Arial"/>
+                <w:b w:val="0"/>
+                <w:bCs w:val="0"/>
+                <w:i w:val="0"/>
+                <w:iCs w:val="0"/>
+                <w:smallCaps w:val="0"/>
+                <w:strike w:val="0"/>
                 <w:color w:val="000000"/>
+                <w:sz w:val="22"/>
+                <w:szCs w:val="22"/>
                 <w:u w:val="none"/>
+                <w:shd w:fill="auto" w:val="clear"/>
+                <w:vertAlign w:val="baseline"/>
                 <w:rtl w:val="0"/>
               </w:rPr>
               <w:t xml:space="preserve">3.3. Fluxos Alternativos</w:t>
               <w:tab/>
-              <w:t xml:space="preserve">7</w:t>
+              <w:t xml:space="preserve">8</w:t>
             </w:r>
           </w:hyperlink>
           <w:r>
@@ -2265,20 +2113,42 @@
             <w:spacing w:line="240" w:lineRule="auto"/>
             <w:ind w:left="1080" w:right="0" w:firstLine="0"/>
             <w:rPr>
+              <w:rFonts w:ascii="Arial" w:cs="Arial" w:eastAsia="Arial" w:hAnsi="Arial"/>
+              <w:b w:val="0"/>
+              <w:bCs w:val="0"/>
+              <w:i w:val="0"/>
+              <w:iCs w:val="0"/>
+              <w:smallCaps w:val="0"/>
+              <w:strike w:val="0"/>
               <w:color w:val="000000"/>
+              <w:sz w:val="22"/>
+              <w:szCs w:val="22"/>
               <w:u w:val="none"/>
+              <w:shd w:fill="auto" w:val="clear"/>
+              <w:vertAlign w:val="baseline"/>
             </w:rPr>
           </w:pPr>
           <w:hyperlink w:anchor="_mwx0kw3bjet1">
             <w:r>
               <w:rPr>
+                <w:rFonts w:ascii="Arial" w:cs="Arial" w:eastAsia="Arial" w:hAnsi="Arial"/>
+                <w:b w:val="0"/>
+                <w:bCs w:val="0"/>
+                <w:i w:val="0"/>
+                <w:iCs w:val="0"/>
+                <w:smallCaps w:val="0"/>
+                <w:strike w:val="0"/>
                 <w:color w:val="000000"/>
+                <w:sz w:val="22"/>
+                <w:szCs w:val="22"/>
                 <w:u w:val="none"/>
-                <w:rtl w:val="0"/>
-              </w:rPr>
-              <w:t xml:space="preserve">3.3.1. (A01) – Cancelar Cadastro</w:t>
+                <w:shd w:fill="auto" w:val="clear"/>
+                <w:vertAlign w:val="baseline"/>
+                <w:rtl w:val="0"/>
+              </w:rPr>
+              <w:t xml:space="preserve">3.3.1. (A02) – Cancelar Cadastro</w:t>
               <w:tab/>
-              <w:t xml:space="preserve">7</w:t>
+              <w:t xml:space="preserve">8</w:t>
             </w:r>
           </w:hyperlink>
           <w:r>
@@ -2295,20 +2165,42 @@
             <w:spacing w:line="240" w:lineRule="auto"/>
             <w:ind w:left="720" w:right="0" w:firstLine="0"/>
             <w:rPr>
+              <w:rFonts w:ascii="Arial" w:cs="Arial" w:eastAsia="Arial" w:hAnsi="Arial"/>
+              <w:b w:val="0"/>
+              <w:bCs w:val="0"/>
+              <w:i w:val="0"/>
+              <w:iCs w:val="0"/>
+              <w:smallCaps w:val="0"/>
+              <w:strike w:val="0"/>
               <w:color w:val="000000"/>
+              <w:sz w:val="22"/>
+              <w:szCs w:val="22"/>
               <w:u w:val="none"/>
+              <w:shd w:fill="auto" w:val="clear"/>
+              <w:vertAlign w:val="baseline"/>
             </w:rPr>
           </w:pPr>
           <w:hyperlink w:anchor="_jmvid5jk5lrn">
             <w:r>
               <w:rPr>
+                <w:rFonts w:ascii="Arial" w:cs="Arial" w:eastAsia="Arial" w:hAnsi="Arial"/>
+                <w:b w:val="0"/>
+                <w:bCs w:val="0"/>
+                <w:i w:val="0"/>
+                <w:iCs w:val="0"/>
+                <w:smallCaps w:val="0"/>
+                <w:strike w:val="0"/>
                 <w:color w:val="000000"/>
+                <w:sz w:val="22"/>
+                <w:szCs w:val="22"/>
                 <w:u w:val="none"/>
+                <w:shd w:fill="auto" w:val="clear"/>
+                <w:vertAlign w:val="baseline"/>
                 <w:rtl w:val="0"/>
               </w:rPr>
               <w:t xml:space="preserve">3.4. Exceções</w:t>
               <w:tab/>
-              <w:t xml:space="preserve">8</w:t>
+              <w:t xml:space="preserve">9</w:t>
             </w:r>
           </w:hyperlink>
           <w:r>
@@ -2325,20 +2217,42 @@
             <w:spacing w:line="240" w:lineRule="auto"/>
             <w:ind w:left="1080" w:right="0" w:firstLine="0"/>
             <w:rPr>
+              <w:rFonts w:ascii="Arial" w:cs="Arial" w:eastAsia="Arial" w:hAnsi="Arial"/>
+              <w:b w:val="0"/>
+              <w:bCs w:val="0"/>
+              <w:i w:val="0"/>
+              <w:iCs w:val="0"/>
+              <w:smallCaps w:val="0"/>
+              <w:strike w:val="0"/>
               <w:color w:val="000000"/>
+              <w:sz w:val="22"/>
+              <w:szCs w:val="22"/>
               <w:u w:val="none"/>
+              <w:shd w:fill="auto" w:val="clear"/>
+              <w:vertAlign w:val="baseline"/>
             </w:rPr>
           </w:pPr>
           <w:hyperlink w:anchor="_a2sww8talp11">
             <w:r>
               <w:rPr>
+                <w:rFonts w:ascii="Arial" w:cs="Arial" w:eastAsia="Arial" w:hAnsi="Arial"/>
+                <w:b w:val="0"/>
+                <w:bCs w:val="0"/>
+                <w:i w:val="0"/>
+                <w:iCs w:val="0"/>
+                <w:smallCaps w:val="0"/>
+                <w:strike w:val="0"/>
                 <w:color w:val="000000"/>
+                <w:sz w:val="22"/>
+                <w:szCs w:val="22"/>
                 <w:u w:val="none"/>
-                <w:rtl w:val="0"/>
-              </w:rPr>
-              <w:t xml:space="preserve">3.4.1. (E01) – CPF Inválido ou Já Cadastrado</w:t>
+                <w:shd w:fill="auto" w:val="clear"/>
+                <w:vertAlign w:val="baseline"/>
+                <w:rtl w:val="0"/>
+              </w:rPr>
+              <w:t xml:space="preserve">3.4.1. (E02) – CPF Inválido ou Já Cadastrado</w:t>
               <w:tab/>
-              <w:t xml:space="preserve">8</w:t>
+              <w:t xml:space="preserve">9</w:t>
             </w:r>
           </w:hyperlink>
           <w:r>
@@ -2355,20 +2269,42 @@
             <w:spacing w:line="240" w:lineRule="auto"/>
             <w:ind w:left="1080" w:right="0" w:firstLine="0"/>
             <w:rPr>
+              <w:rFonts w:ascii="Arial" w:cs="Arial" w:eastAsia="Arial" w:hAnsi="Arial"/>
+              <w:b w:val="0"/>
+              <w:bCs w:val="0"/>
+              <w:i w:val="0"/>
+              <w:iCs w:val="0"/>
+              <w:smallCaps w:val="0"/>
+              <w:strike w:val="0"/>
               <w:color w:val="000000"/>
+              <w:sz w:val="22"/>
+              <w:szCs w:val="22"/>
               <w:u w:val="none"/>
+              <w:shd w:fill="auto" w:val="clear"/>
+              <w:vertAlign w:val="baseline"/>
             </w:rPr>
           </w:pPr>
           <w:hyperlink w:anchor="_ykichvtc85jf">
             <w:r>
               <w:rPr>
+                <w:rFonts w:ascii="Arial" w:cs="Arial" w:eastAsia="Arial" w:hAnsi="Arial"/>
+                <w:b w:val="0"/>
+                <w:bCs w:val="0"/>
+                <w:i w:val="0"/>
+                <w:iCs w:val="0"/>
+                <w:smallCaps w:val="0"/>
+                <w:strike w:val="0"/>
                 <w:color w:val="000000"/>
+                <w:sz w:val="22"/>
+                <w:szCs w:val="22"/>
                 <w:u w:val="none"/>
-                <w:rtl w:val="0"/>
-              </w:rPr>
-              <w:t xml:space="preserve">3.4.2. (E02) – Email já cadastrado</w:t>
+                <w:shd w:fill="auto" w:val="clear"/>
+                <w:vertAlign w:val="baseline"/>
+                <w:rtl w:val="0"/>
+              </w:rPr>
+              <w:t xml:space="preserve">3.4.2. (E03) – Email já cadastrado</w:t>
               <w:tab/>
-              <w:t xml:space="preserve">8</w:t>
+              <w:t xml:space="preserve">9</w:t>
             </w:r>
           </w:hyperlink>
           <w:r>
@@ -2385,20 +2321,42 @@
             <w:spacing w:line="240" w:lineRule="auto"/>
             <w:ind w:left="1080" w:right="0" w:firstLine="0"/>
             <w:rPr>
+              <w:rFonts w:ascii="Arial" w:cs="Arial" w:eastAsia="Arial" w:hAnsi="Arial"/>
+              <w:b w:val="0"/>
+              <w:bCs w:val="0"/>
+              <w:i w:val="0"/>
+              <w:iCs w:val="0"/>
+              <w:smallCaps w:val="0"/>
+              <w:strike w:val="0"/>
               <w:color w:val="000000"/>
+              <w:sz w:val="22"/>
+              <w:szCs w:val="22"/>
               <w:u w:val="none"/>
+              <w:shd w:fill="auto" w:val="clear"/>
+              <w:vertAlign w:val="baseline"/>
             </w:rPr>
           </w:pPr>
           <w:hyperlink w:anchor="_s37590ujcdjx">
             <w:r>
               <w:rPr>
+                <w:rFonts w:ascii="Arial" w:cs="Arial" w:eastAsia="Arial" w:hAnsi="Arial"/>
+                <w:b w:val="0"/>
+                <w:bCs w:val="0"/>
+                <w:i w:val="0"/>
+                <w:iCs w:val="0"/>
+                <w:smallCaps w:val="0"/>
+                <w:strike w:val="0"/>
                 <w:color w:val="000000"/>
+                <w:sz w:val="22"/>
+                <w:szCs w:val="22"/>
                 <w:u w:val="none"/>
-                <w:rtl w:val="0"/>
-              </w:rPr>
-              <w:t xml:space="preserve">3.4.3. (E03) - Usuário Menor de Idade</w:t>
+                <w:shd w:fill="auto" w:val="clear"/>
+                <w:vertAlign w:val="baseline"/>
+                <w:rtl w:val="0"/>
+              </w:rPr>
+              <w:t xml:space="preserve">3.4.3. (E04) - Usuário Menor de Idade</w:t>
               <w:tab/>
-              <w:t xml:space="preserve">8</w:t>
+              <w:t xml:space="preserve">9</w:t>
             </w:r>
           </w:hyperlink>
           <w:r>
@@ -2415,20 +2373,42 @@
             <w:spacing w:line="240" w:lineRule="auto"/>
             <w:ind w:left="360" w:right="0" w:firstLine="0"/>
             <w:rPr>
+              <w:rFonts w:ascii="Arial" w:cs="Arial" w:eastAsia="Arial" w:hAnsi="Arial"/>
+              <w:b w:val="0"/>
+              <w:bCs w:val="0"/>
+              <w:i w:val="0"/>
+              <w:iCs w:val="0"/>
+              <w:smallCaps w:val="0"/>
+              <w:strike w:val="0"/>
               <w:color w:val="000000"/>
+              <w:sz w:val="22"/>
+              <w:szCs w:val="22"/>
               <w:u w:val="none"/>
+              <w:shd w:fill="auto" w:val="clear"/>
+              <w:vertAlign w:val="baseline"/>
             </w:rPr>
           </w:pPr>
           <w:hyperlink w:anchor="_s4yfrmu16n27">
             <w:r>
               <w:rPr>
+                <w:rFonts w:ascii="Arial" w:cs="Arial" w:eastAsia="Arial" w:hAnsi="Arial"/>
+                <w:b w:val="0"/>
+                <w:bCs w:val="0"/>
+                <w:i w:val="0"/>
+                <w:iCs w:val="0"/>
+                <w:smallCaps w:val="0"/>
+                <w:strike w:val="0"/>
                 <w:color w:val="000000"/>
+                <w:sz w:val="22"/>
+                <w:szCs w:val="22"/>
                 <w:u w:val="none"/>
+                <w:shd w:fill="auto" w:val="clear"/>
+                <w:vertAlign w:val="baseline"/>
                 <w:rtl w:val="0"/>
               </w:rPr>
               <w:t xml:space="preserve">4. Pós-condições:</w:t>
               <w:tab/>
-              <w:t xml:space="preserve">9</w:t>
+              <w:t xml:space="preserve">10</w:t>
             </w:r>
           </w:hyperlink>
           <w:r>
@@ -2445,20 +2425,42 @@
             <w:spacing w:line="240" w:lineRule="auto"/>
             <w:ind w:left="360" w:right="0" w:firstLine="0"/>
             <w:rPr>
+              <w:rFonts w:ascii="Arial" w:cs="Arial" w:eastAsia="Arial" w:hAnsi="Arial"/>
+              <w:b w:val="0"/>
+              <w:bCs w:val="0"/>
+              <w:i w:val="0"/>
+              <w:iCs w:val="0"/>
+              <w:smallCaps w:val="0"/>
+              <w:strike w:val="0"/>
               <w:color w:val="000000"/>
+              <w:sz w:val="22"/>
+              <w:szCs w:val="22"/>
               <w:u w:val="none"/>
+              <w:shd w:fill="auto" w:val="clear"/>
+              <w:vertAlign w:val="baseline"/>
             </w:rPr>
           </w:pPr>
           <w:hyperlink w:anchor="_byo3v5cx7vhm">
             <w:r>
               <w:rPr>
+                <w:rFonts w:ascii="Arial" w:cs="Arial" w:eastAsia="Arial" w:hAnsi="Arial"/>
+                <w:b w:val="0"/>
+                <w:bCs w:val="0"/>
+                <w:i w:val="0"/>
+                <w:iCs w:val="0"/>
+                <w:smallCaps w:val="0"/>
+                <w:strike w:val="0"/>
                 <w:color w:val="000000"/>
+                <w:sz w:val="22"/>
+                <w:szCs w:val="22"/>
                 <w:u w:val="none"/>
+                <w:shd w:fill="auto" w:val="clear"/>
+                <w:vertAlign w:val="baseline"/>
                 <w:rtl w:val="0"/>
               </w:rPr>
               <w:t xml:space="preserve">5. Requisitos Especiais</w:t>
               <w:tab/>
-              <w:t xml:space="preserve">9</w:t>
+              <w:t xml:space="preserve">10</w:t>
             </w:r>
           </w:hyperlink>
           <w:r>
@@ -2475,20 +2477,42 @@
             <w:spacing w:line="240" w:lineRule="auto"/>
             <w:ind w:left="360" w:right="0" w:firstLine="0"/>
             <w:rPr>
+              <w:rFonts w:ascii="Arial" w:cs="Arial" w:eastAsia="Arial" w:hAnsi="Arial"/>
+              <w:b w:val="0"/>
+              <w:bCs w:val="0"/>
+              <w:i w:val="0"/>
+              <w:iCs w:val="0"/>
+              <w:smallCaps w:val="0"/>
+              <w:strike w:val="0"/>
               <w:color w:val="000000"/>
+              <w:sz w:val="22"/>
+              <w:szCs w:val="22"/>
               <w:u w:val="none"/>
+              <w:shd w:fill="auto" w:val="clear"/>
+              <w:vertAlign w:val="baseline"/>
             </w:rPr>
           </w:pPr>
           <w:hyperlink w:anchor="_s39nsmhvr8xv">
             <w:r>
               <w:rPr>
+                <w:rFonts w:ascii="Arial" w:cs="Arial" w:eastAsia="Arial" w:hAnsi="Arial"/>
+                <w:b w:val="0"/>
+                <w:bCs w:val="0"/>
+                <w:i w:val="0"/>
+                <w:iCs w:val="0"/>
+                <w:smallCaps w:val="0"/>
+                <w:strike w:val="0"/>
                 <w:color w:val="000000"/>
+                <w:sz w:val="22"/>
+                <w:szCs w:val="22"/>
                 <w:u w:val="none"/>
+                <w:shd w:fill="auto" w:val="clear"/>
+                <w:vertAlign w:val="baseline"/>
                 <w:rtl w:val="0"/>
               </w:rPr>
               <w:t xml:space="preserve">6. Regras de negócio específicas</w:t>
               <w:tab/>
-              <w:t xml:space="preserve">9</w:t>
+              <w:t xml:space="preserve">10</w:t>
             </w:r>
           </w:hyperlink>
           <w:r>
@@ -2505,20 +2529,42 @@
             <w:spacing w:line="240" w:lineRule="auto"/>
             <w:ind w:left="360" w:right="0" w:firstLine="0"/>
             <w:rPr>
+              <w:rFonts w:ascii="Arial" w:cs="Arial" w:eastAsia="Arial" w:hAnsi="Arial"/>
+              <w:b w:val="0"/>
+              <w:bCs w:val="0"/>
+              <w:i w:val="0"/>
+              <w:iCs w:val="0"/>
+              <w:smallCaps w:val="0"/>
+              <w:strike w:val="0"/>
               <w:color w:val="000000"/>
+              <w:sz w:val="22"/>
+              <w:szCs w:val="22"/>
               <w:u w:val="none"/>
+              <w:shd w:fill="auto" w:val="clear"/>
+              <w:vertAlign w:val="baseline"/>
             </w:rPr>
           </w:pPr>
           <w:hyperlink w:anchor="_rof4yigfb6ul">
             <w:r>
               <w:rPr>
+                <w:rFonts w:ascii="Arial" w:cs="Arial" w:eastAsia="Arial" w:hAnsi="Arial"/>
+                <w:b w:val="0"/>
+                <w:bCs w:val="0"/>
+                <w:i w:val="0"/>
+                <w:iCs w:val="0"/>
+                <w:smallCaps w:val="0"/>
+                <w:strike w:val="0"/>
                 <w:color w:val="000000"/>
+                <w:sz w:val="22"/>
+                <w:szCs w:val="22"/>
                 <w:u w:val="none"/>
+                <w:shd w:fill="auto" w:val="clear"/>
+                <w:vertAlign w:val="baseline"/>
                 <w:rtl w:val="0"/>
               </w:rPr>
               <w:t xml:space="preserve">7. Detalhamento das Interfaces com Usuários</w:t>
               <w:tab/>
-              <w:t xml:space="preserve">9</w:t>
+              <w:t xml:space="preserve">10</w:t>
             </w:r>
           </w:hyperlink>
           <w:r>
@@ -2535,20 +2581,42 @@
             <w:spacing w:line="240" w:lineRule="auto"/>
             <w:ind w:left="720" w:right="0" w:firstLine="0"/>
             <w:rPr>
+              <w:rFonts w:ascii="Arial" w:cs="Arial" w:eastAsia="Arial" w:hAnsi="Arial"/>
+              <w:b w:val="0"/>
+              <w:bCs w:val="0"/>
+              <w:i w:val="0"/>
+              <w:iCs w:val="0"/>
+              <w:smallCaps w:val="0"/>
+              <w:strike w:val="0"/>
               <w:color w:val="000000"/>
+              <w:sz w:val="22"/>
+              <w:szCs w:val="22"/>
               <w:u w:val="none"/>
+              <w:shd w:fill="auto" w:val="clear"/>
+              <w:vertAlign w:val="baseline"/>
             </w:rPr>
           </w:pPr>
           <w:hyperlink w:anchor="_8cx05p9u0snm">
             <w:r>
               <w:rPr>
+                <w:rFonts w:ascii="Arial" w:cs="Arial" w:eastAsia="Arial" w:hAnsi="Arial"/>
+                <w:b w:val="0"/>
+                <w:bCs w:val="0"/>
+                <w:i w:val="0"/>
+                <w:iCs w:val="0"/>
+                <w:smallCaps w:val="0"/>
+                <w:strike w:val="0"/>
                 <w:color w:val="000000"/>
+                <w:sz w:val="22"/>
+                <w:szCs w:val="22"/>
                 <w:u w:val="none"/>
-                <w:rtl w:val="0"/>
-              </w:rPr>
-              <w:t xml:space="preserve">7.1. (I01) - Nome da Interface com Usuário</w:t>
+                <w:shd w:fill="auto" w:val="clear"/>
+                <w:vertAlign w:val="baseline"/>
+                <w:rtl w:val="0"/>
+              </w:rPr>
+              <w:t xml:space="preserve">7.1. (I02) - Nome da Interface com Usuário</w:t>
               <w:tab/>
-              <w:t xml:space="preserve">9</w:t>
+              <w:t xml:space="preserve">10</w:t>
             </w:r>
           </w:hyperlink>
           <w:r>
@@ -2565,20 +2633,42 @@
             <w:spacing w:line="240" w:lineRule="auto"/>
             <w:ind w:left="360" w:right="0" w:firstLine="0"/>
             <w:rPr>
+              <w:rFonts w:ascii="Arial" w:cs="Arial" w:eastAsia="Arial" w:hAnsi="Arial"/>
+              <w:b w:val="0"/>
+              <w:bCs w:val="0"/>
+              <w:i w:val="0"/>
+              <w:iCs w:val="0"/>
+              <w:smallCaps w:val="0"/>
+              <w:strike w:val="0"/>
               <w:color w:val="000000"/>
+              <w:sz w:val="22"/>
+              <w:szCs w:val="22"/>
               <w:u w:val="none"/>
+              <w:shd w:fill="auto" w:val="clear"/>
+              <w:vertAlign w:val="baseline"/>
             </w:rPr>
           </w:pPr>
           <w:hyperlink w:anchor="_dy6whsc3eztu">
             <w:r>
               <w:rPr>
+                <w:rFonts w:ascii="Arial" w:cs="Arial" w:eastAsia="Arial" w:hAnsi="Arial"/>
+                <w:b w:val="0"/>
+                <w:bCs w:val="0"/>
+                <w:i w:val="0"/>
+                <w:iCs w:val="0"/>
+                <w:smallCaps w:val="0"/>
+                <w:strike w:val="0"/>
                 <w:color w:val="000000"/>
+                <w:sz w:val="22"/>
+                <w:szCs w:val="22"/>
                 <w:u w:val="none"/>
+                <w:shd w:fill="auto" w:val="clear"/>
+                <w:vertAlign w:val="baseline"/>
                 <w:rtl w:val="0"/>
               </w:rPr>
               <w:t xml:space="preserve">8. Demais Interfaces</w:t>
               <w:tab/>
-              <w:t xml:space="preserve">10</w:t>
+              <w:t xml:space="preserve">11</w:t>
             </w:r>
           </w:hyperlink>
           <w:r>
@@ -2595,20 +2685,42 @@
             <w:spacing w:line="240" w:lineRule="auto"/>
             <w:ind w:left="360" w:right="0" w:firstLine="0"/>
             <w:rPr>
+              <w:rFonts w:ascii="Arial" w:cs="Arial" w:eastAsia="Arial" w:hAnsi="Arial"/>
+              <w:b w:val="0"/>
+              <w:bCs w:val="0"/>
+              <w:i w:val="0"/>
+              <w:iCs w:val="0"/>
+              <w:smallCaps w:val="0"/>
+              <w:strike w:val="0"/>
               <w:color w:val="000000"/>
+              <w:sz w:val="22"/>
+              <w:szCs w:val="22"/>
               <w:u w:val="none"/>
+              <w:shd w:fill="auto" w:val="clear"/>
+              <w:vertAlign w:val="baseline"/>
             </w:rPr>
           </w:pPr>
           <w:hyperlink w:anchor="_eec7yc8xxvgz">
             <w:r>
               <w:rPr>
+                <w:rFonts w:ascii="Arial" w:cs="Arial" w:eastAsia="Arial" w:hAnsi="Arial"/>
+                <w:b w:val="0"/>
+                <w:bCs w:val="0"/>
+                <w:i w:val="0"/>
+                <w:iCs w:val="0"/>
+                <w:smallCaps w:val="0"/>
+                <w:strike w:val="0"/>
                 <w:color w:val="000000"/>
+                <w:sz w:val="22"/>
+                <w:szCs w:val="22"/>
                 <w:u w:val="none"/>
+                <w:shd w:fill="auto" w:val="clear"/>
+                <w:vertAlign w:val="baseline"/>
                 <w:rtl w:val="0"/>
               </w:rPr>
               <w:t xml:space="preserve">9. Observações</w:t>
               <w:tab/>
-              <w:t xml:space="preserve">10</w:t>
+              <w:t xml:space="preserve">11</w:t>
             </w:r>
           </w:hyperlink>
           <w:r>
@@ -2625,24 +2737,42 @@
             <w:spacing w:line="240" w:lineRule="auto"/>
             <w:ind w:left="0" w:right="0" w:firstLine="0"/>
             <w:rPr>
+              <w:rFonts w:ascii="Arial" w:cs="Arial" w:eastAsia="Arial" w:hAnsi="Arial"/>
               <w:b w:val="1"/>
               <w:bCs w:val="1"/>
+              <w:i w:val="0"/>
+              <w:iCs w:val="0"/>
+              <w:smallCaps w:val="0"/>
+              <w:strike w:val="0"/>
               <w:color w:val="000000"/>
+              <w:sz w:val="22"/>
+              <w:szCs w:val="22"/>
               <w:u w:val="none"/>
+              <w:shd w:fill="auto" w:val="clear"/>
+              <w:vertAlign w:val="baseline"/>
             </w:rPr>
           </w:pPr>
           <w:hyperlink w:anchor="_n16a8iogdcdo">
             <w:r>
               <w:rPr>
+                <w:rFonts w:ascii="Arial" w:cs="Arial" w:eastAsia="Arial" w:hAnsi="Arial"/>
                 <w:b w:val="1"/>
                 <w:bCs w:val="1"/>
+                <w:i w:val="0"/>
+                <w:iCs w:val="0"/>
+                <w:smallCaps w:val="0"/>
+                <w:strike w:val="0"/>
                 <w:color w:val="000000"/>
+                <w:sz w:val="22"/>
+                <w:szCs w:val="22"/>
                 <w:u w:val="none"/>
+                <w:shd w:fill="auto" w:val="clear"/>
+                <w:vertAlign w:val="baseline"/>
                 <w:rtl w:val="0"/>
               </w:rPr>
               <w:t xml:space="preserve">Especificação de Caso de Uso: Visualizar Instituições de Saúde Próximas</w:t>
               <w:tab/>
-              <w:t xml:space="preserve">11</w:t>
+              <w:t xml:space="preserve">12</w:t>
             </w:r>
           </w:hyperlink>
           <w:r>
@@ -2659,20 +2789,42 @@
             <w:spacing w:line="240" w:lineRule="auto"/>
             <w:ind w:left="360" w:right="0" w:firstLine="0"/>
             <w:rPr>
+              <w:rFonts w:ascii="Arial" w:cs="Arial" w:eastAsia="Arial" w:hAnsi="Arial"/>
+              <w:b w:val="0"/>
+              <w:bCs w:val="0"/>
+              <w:i w:val="0"/>
+              <w:iCs w:val="0"/>
+              <w:smallCaps w:val="0"/>
+              <w:strike w:val="0"/>
               <w:color w:val="000000"/>
+              <w:sz w:val="22"/>
+              <w:szCs w:val="22"/>
               <w:u w:val="none"/>
+              <w:shd w:fill="auto" w:val="clear"/>
+              <w:vertAlign w:val="baseline"/>
             </w:rPr>
           </w:pPr>
           <w:hyperlink w:anchor="_vlbpi5ucagod">
             <w:r>
               <w:rPr>
+                <w:rFonts w:ascii="Arial" w:cs="Arial" w:eastAsia="Arial" w:hAnsi="Arial"/>
+                <w:b w:val="0"/>
+                <w:bCs w:val="0"/>
+                <w:i w:val="0"/>
+                <w:iCs w:val="0"/>
+                <w:smallCaps w:val="0"/>
+                <w:strike w:val="0"/>
                 <w:color w:val="000000"/>
+                <w:sz w:val="22"/>
+                <w:szCs w:val="22"/>
                 <w:u w:val="none"/>
+                <w:shd w:fill="auto" w:val="clear"/>
+                <w:vertAlign w:val="baseline"/>
                 <w:rtl w:val="0"/>
               </w:rPr>
               <w:t xml:space="preserve">1. Descrição</w:t>
               <w:tab/>
-              <w:t xml:space="preserve">11</w:t>
+              <w:t xml:space="preserve">12</w:t>
             </w:r>
           </w:hyperlink>
           <w:r>
@@ -2689,20 +2841,42 @@
             <w:spacing w:line="240" w:lineRule="auto"/>
             <w:ind w:left="360" w:right="0" w:firstLine="0"/>
             <w:rPr>
+              <w:rFonts w:ascii="Arial" w:cs="Arial" w:eastAsia="Arial" w:hAnsi="Arial"/>
+              <w:b w:val="0"/>
+              <w:bCs w:val="0"/>
+              <w:i w:val="0"/>
+              <w:iCs w:val="0"/>
+              <w:smallCaps w:val="0"/>
+              <w:strike w:val="0"/>
               <w:color w:val="000000"/>
+              <w:sz w:val="22"/>
+              <w:szCs w:val="22"/>
               <w:u w:val="none"/>
+              <w:shd w:fill="auto" w:val="clear"/>
+              <w:vertAlign w:val="baseline"/>
             </w:rPr>
           </w:pPr>
           <w:hyperlink w:anchor="_vvf29jgi4j1s">
             <w:r>
               <w:rPr>
+                <w:rFonts w:ascii="Arial" w:cs="Arial" w:eastAsia="Arial" w:hAnsi="Arial"/>
+                <w:b w:val="0"/>
+                <w:bCs w:val="0"/>
+                <w:i w:val="0"/>
+                <w:iCs w:val="0"/>
+                <w:smallCaps w:val="0"/>
+                <w:strike w:val="0"/>
                 <w:color w:val="000000"/>
+                <w:sz w:val="22"/>
+                <w:szCs w:val="22"/>
                 <w:u w:val="none"/>
+                <w:shd w:fill="auto" w:val="clear"/>
+                <w:vertAlign w:val="baseline"/>
                 <w:rtl w:val="0"/>
               </w:rPr>
               <w:t xml:space="preserve">2. Pré-condições</w:t>
               <w:tab/>
-              <w:t xml:space="preserve">11</w:t>
+              <w:t xml:space="preserve">12</w:t>
             </w:r>
           </w:hyperlink>
           <w:r>
@@ -2719,20 +2893,42 @@
             <w:spacing w:line="240" w:lineRule="auto"/>
             <w:ind w:left="360" w:right="0" w:firstLine="0"/>
             <w:rPr>
+              <w:rFonts w:ascii="Arial" w:cs="Arial" w:eastAsia="Arial" w:hAnsi="Arial"/>
+              <w:b w:val="0"/>
+              <w:bCs w:val="0"/>
+              <w:i w:val="0"/>
+              <w:iCs w:val="0"/>
+              <w:smallCaps w:val="0"/>
+              <w:strike w:val="0"/>
               <w:color w:val="000000"/>
+              <w:sz w:val="22"/>
+              <w:szCs w:val="22"/>
               <w:u w:val="none"/>
+              <w:shd w:fill="auto" w:val="clear"/>
+              <w:vertAlign w:val="baseline"/>
             </w:rPr>
           </w:pPr>
           <w:hyperlink w:anchor="_hm6mc1liiobu">
             <w:r>
               <w:rPr>
+                <w:rFonts w:ascii="Arial" w:cs="Arial" w:eastAsia="Arial" w:hAnsi="Arial"/>
+                <w:b w:val="0"/>
+                <w:bCs w:val="0"/>
+                <w:i w:val="0"/>
+                <w:iCs w:val="0"/>
+                <w:smallCaps w:val="0"/>
+                <w:strike w:val="0"/>
                 <w:color w:val="000000"/>
+                <w:sz w:val="22"/>
+                <w:szCs w:val="22"/>
                 <w:u w:val="none"/>
+                <w:shd w:fill="auto" w:val="clear"/>
+                <w:vertAlign w:val="baseline"/>
                 <w:rtl w:val="0"/>
               </w:rPr>
               <w:t xml:space="preserve">3. Fluxo de Eventos</w:t>
               <w:tab/>
-              <w:t xml:space="preserve">11</w:t>
+              <w:t xml:space="preserve">12</w:t>
             </w:r>
           </w:hyperlink>
           <w:r>
@@ -2749,20 +2945,42 @@
             <w:spacing w:line="240" w:lineRule="auto"/>
             <w:ind w:left="720" w:right="0" w:firstLine="0"/>
             <w:rPr>
+              <w:rFonts w:ascii="Arial" w:cs="Arial" w:eastAsia="Arial" w:hAnsi="Arial"/>
+              <w:b w:val="0"/>
+              <w:bCs w:val="0"/>
+              <w:i w:val="0"/>
+              <w:iCs w:val="0"/>
+              <w:smallCaps w:val="0"/>
+              <w:strike w:val="0"/>
               <w:color w:val="000000"/>
+              <w:sz w:val="22"/>
+              <w:szCs w:val="22"/>
               <w:u w:val="none"/>
+              <w:shd w:fill="auto" w:val="clear"/>
+              <w:vertAlign w:val="baseline"/>
             </w:rPr>
           </w:pPr>
           <w:hyperlink w:anchor="_5othh5j9t8oe">
             <w:r>
               <w:rPr>
+                <w:rFonts w:ascii="Arial" w:cs="Arial" w:eastAsia="Arial" w:hAnsi="Arial"/>
+                <w:b w:val="0"/>
+                <w:bCs w:val="0"/>
+                <w:i w:val="0"/>
+                <w:iCs w:val="0"/>
+                <w:smallCaps w:val="0"/>
+                <w:strike w:val="0"/>
                 <w:color w:val="000000"/>
+                <w:sz w:val="22"/>
+                <w:szCs w:val="22"/>
                 <w:u w:val="none"/>
+                <w:shd w:fill="auto" w:val="clear"/>
+                <w:vertAlign w:val="baseline"/>
                 <w:rtl w:val="0"/>
               </w:rPr>
               <w:t xml:space="preserve">3.1. Fluxo Básico</w:t>
               <w:tab/>
-              <w:t xml:space="preserve">11</w:t>
+              <w:t xml:space="preserve">12</w:t>
             </w:r>
           </w:hyperlink>
           <w:r>
@@ -2779,20 +2997,42 @@
             <w:spacing w:line="240" w:lineRule="auto"/>
             <w:ind w:left="720" w:right="0" w:firstLine="0"/>
             <w:rPr>
+              <w:rFonts w:ascii="Arial" w:cs="Arial" w:eastAsia="Arial" w:hAnsi="Arial"/>
+              <w:b w:val="0"/>
+              <w:bCs w:val="0"/>
+              <w:i w:val="0"/>
+              <w:iCs w:val="0"/>
+              <w:smallCaps w:val="0"/>
+              <w:strike w:val="0"/>
               <w:color w:val="000000"/>
+              <w:sz w:val="22"/>
+              <w:szCs w:val="22"/>
               <w:u w:val="none"/>
+              <w:shd w:fill="auto" w:val="clear"/>
+              <w:vertAlign w:val="baseline"/>
             </w:rPr>
           </w:pPr>
           <w:hyperlink w:anchor="_uicy8c5yo9x">
             <w:r>
               <w:rPr>
+                <w:rFonts w:ascii="Arial" w:cs="Arial" w:eastAsia="Arial" w:hAnsi="Arial"/>
+                <w:b w:val="0"/>
+                <w:bCs w:val="0"/>
+                <w:i w:val="0"/>
+                <w:iCs w:val="0"/>
+                <w:smallCaps w:val="0"/>
+                <w:strike w:val="0"/>
                 <w:color w:val="000000"/>
+                <w:sz w:val="22"/>
+                <w:szCs w:val="22"/>
                 <w:u w:val="none"/>
+                <w:shd w:fill="auto" w:val="clear"/>
+                <w:vertAlign w:val="baseline"/>
                 <w:rtl w:val="0"/>
               </w:rPr>
               <w:t xml:space="preserve">3.2. Subfluxos</w:t>
               <w:tab/>
-              <w:t xml:space="preserve">11</w:t>
+              <w:t xml:space="preserve">12</w:t>
             </w:r>
           </w:hyperlink>
           <w:r>
@@ -2809,8 +3049,19 @@
             <w:spacing w:line="240" w:lineRule="auto"/>
             <w:ind w:left="360" w:right="0" w:firstLine="0"/>
             <w:rPr>
+              <w:rFonts w:ascii="Arial" w:cs="Arial" w:eastAsia="Arial" w:hAnsi="Arial"/>
+              <w:b w:val="0"/>
+              <w:bCs w:val="0"/>
+              <w:i w:val="0"/>
+              <w:iCs w:val="0"/>
+              <w:smallCaps w:val="0"/>
+              <w:strike w:val="0"/>
               <w:color w:val="000000"/>
+              <w:sz w:val="22"/>
+              <w:szCs w:val="22"/>
               <w:u w:val="none"/>
+              <w:shd w:fill="auto" w:val="clear"/>
+              <w:vertAlign w:val="baseline"/>
             </w:rPr>
           </w:pPr>
           <w:hyperlink w:anchor="_f17joen6gch">
@@ -2833,7 +3084,7 @@
               </w:rPr>
               <w:t xml:space="preserve">3.3. Fluxos Alternativos</w:t>
               <w:tab/>
-              <w:t xml:space="preserve">11</w:t>
+              <w:t xml:space="preserve">12</w:t>
             </w:r>
           </w:hyperlink>
           <w:r>
@@ -2850,8 +3101,19 @@
             <w:spacing w:line="240" w:lineRule="auto"/>
             <w:ind w:left="360" w:right="0" w:firstLine="0"/>
             <w:rPr>
+              <w:rFonts w:ascii="Arial" w:cs="Arial" w:eastAsia="Arial" w:hAnsi="Arial"/>
+              <w:b w:val="0"/>
+              <w:bCs w:val="0"/>
+              <w:i w:val="0"/>
+              <w:iCs w:val="0"/>
+              <w:smallCaps w:val="0"/>
+              <w:strike w:val="0"/>
               <w:color w:val="000000"/>
+              <w:sz w:val="22"/>
+              <w:szCs w:val="22"/>
               <w:u w:val="none"/>
+              <w:shd w:fill="auto" w:val="clear"/>
+              <w:vertAlign w:val="baseline"/>
             </w:rPr>
           </w:pPr>
           <w:hyperlink w:anchor="_4ssmx1rvxbjw">
@@ -2874,7 +3136,7 @@
               </w:rPr>
               <w:t xml:space="preserve">3.4. Exceções</w:t>
               <w:tab/>
-              <w:t xml:space="preserve">11</w:t>
+              <w:t xml:space="preserve">12</w:t>
             </w:r>
           </w:hyperlink>
           <w:r>
@@ -2891,20 +3153,42 @@
             <w:spacing w:line="240" w:lineRule="auto"/>
             <w:ind w:left="1080" w:right="0" w:firstLine="0"/>
             <w:rPr>
+              <w:rFonts w:ascii="Arial" w:cs="Arial" w:eastAsia="Arial" w:hAnsi="Arial"/>
+              <w:b w:val="0"/>
+              <w:bCs w:val="0"/>
+              <w:i w:val="0"/>
+              <w:iCs w:val="0"/>
+              <w:smallCaps w:val="0"/>
+              <w:strike w:val="0"/>
               <w:color w:val="000000"/>
+              <w:sz w:val="22"/>
+              <w:szCs w:val="22"/>
               <w:u w:val="none"/>
+              <w:shd w:fill="auto" w:val="clear"/>
+              <w:vertAlign w:val="baseline"/>
             </w:rPr>
           </w:pPr>
           <w:hyperlink w:anchor="_o2s7ywd2eob3">
             <w:r>
               <w:rPr>
+                <w:rFonts w:ascii="Arial" w:cs="Arial" w:eastAsia="Arial" w:hAnsi="Arial"/>
+                <w:b w:val="0"/>
+                <w:bCs w:val="0"/>
+                <w:i w:val="0"/>
+                <w:iCs w:val="0"/>
+                <w:smallCaps w:val="0"/>
+                <w:strike w:val="0"/>
                 <w:color w:val="000000"/>
+                <w:sz w:val="22"/>
+                <w:szCs w:val="22"/>
                 <w:u w:val="none"/>
-                <w:rtl w:val="0"/>
-              </w:rPr>
-              <w:t xml:space="preserve">3.4.1. (E01) – Localização Desativada</w:t>
+                <w:shd w:fill="auto" w:val="clear"/>
+                <w:vertAlign w:val="baseline"/>
+                <w:rtl w:val="0"/>
+              </w:rPr>
+              <w:t xml:space="preserve">3.4.1. (E05) – Localização Desativada</w:t>
               <w:tab/>
-              <w:t xml:space="preserve">11</w:t>
+              <w:t xml:space="preserve">12</w:t>
             </w:r>
           </w:hyperlink>
           <w:r>
@@ -2921,8 +3205,19 @@
             <w:spacing w:line="240" w:lineRule="auto"/>
             <w:ind w:left="360" w:right="0" w:firstLine="0"/>
             <w:rPr>
+              <w:rFonts w:ascii="Arial" w:cs="Arial" w:eastAsia="Arial" w:hAnsi="Arial"/>
+              <w:b w:val="0"/>
+              <w:bCs w:val="0"/>
+              <w:i w:val="0"/>
+              <w:iCs w:val="0"/>
+              <w:smallCaps w:val="0"/>
+              <w:strike w:val="0"/>
               <w:color w:val="000000"/>
+              <w:sz w:val="22"/>
+              <w:szCs w:val="22"/>
               <w:u w:val="none"/>
+              <w:shd w:fill="auto" w:val="clear"/>
+              <w:vertAlign w:val="baseline"/>
             </w:rPr>
           </w:pPr>
           <w:hyperlink w:anchor="_uhslrpyq4wxw">
@@ -2945,7 +3240,7 @@
               </w:rPr>
               <w:t xml:space="preserve">4. Pós-condições</w:t>
               <w:tab/>
-              <w:t xml:space="preserve">12</w:t>
+              <w:t xml:space="preserve">13</w:t>
             </w:r>
           </w:hyperlink>
           <w:r>
@@ -2962,8 +3257,19 @@
             <w:spacing w:line="240" w:lineRule="auto"/>
             <w:ind w:left="360" w:right="0" w:firstLine="0"/>
             <w:rPr>
+              <w:rFonts w:ascii="Arial" w:cs="Arial" w:eastAsia="Arial" w:hAnsi="Arial"/>
+              <w:b w:val="0"/>
+              <w:bCs w:val="0"/>
+              <w:i w:val="0"/>
+              <w:iCs w:val="0"/>
+              <w:smallCaps w:val="0"/>
+              <w:strike w:val="0"/>
               <w:color w:val="000000"/>
+              <w:sz w:val="22"/>
+              <w:szCs w:val="22"/>
               <w:u w:val="none"/>
+              <w:shd w:fill="auto" w:val="clear"/>
+              <w:vertAlign w:val="baseline"/>
             </w:rPr>
           </w:pPr>
           <w:hyperlink w:anchor="_g0j51yi77sne">
@@ -2986,7 +3292,7 @@
               </w:rPr>
               <w:t xml:space="preserve">5. Requisitos Especiais</w:t>
               <w:tab/>
-              <w:t xml:space="preserve">12</w:t>
+              <w:t xml:space="preserve">13</w:t>
             </w:r>
           </w:hyperlink>
           <w:r>
@@ -3003,8 +3309,19 @@
             <w:spacing w:line="240" w:lineRule="auto"/>
             <w:ind w:left="360" w:right="0" w:firstLine="0"/>
             <w:rPr>
+              <w:rFonts w:ascii="Arial" w:cs="Arial" w:eastAsia="Arial" w:hAnsi="Arial"/>
+              <w:b w:val="0"/>
+              <w:bCs w:val="0"/>
+              <w:i w:val="0"/>
+              <w:iCs w:val="0"/>
+              <w:smallCaps w:val="0"/>
+              <w:strike w:val="0"/>
               <w:color w:val="000000"/>
+              <w:sz w:val="22"/>
+              <w:szCs w:val="22"/>
               <w:u w:val="none"/>
+              <w:shd w:fill="auto" w:val="clear"/>
+              <w:vertAlign w:val="baseline"/>
             </w:rPr>
           </w:pPr>
           <w:hyperlink w:anchor="_hhivnz14myn">
@@ -3027,7 +3344,7 @@
               </w:rPr>
               <w:t xml:space="preserve">6. Regras de negócio específicas</w:t>
               <w:tab/>
-              <w:t xml:space="preserve">12</w:t>
+              <w:t xml:space="preserve">13</w:t>
             </w:r>
           </w:hyperlink>
           <w:r>
@@ -3044,8 +3361,19 @@
             <w:spacing w:line="240" w:lineRule="auto"/>
             <w:ind w:left="360" w:right="0" w:firstLine="0"/>
             <w:rPr>
+              <w:rFonts w:ascii="Arial" w:cs="Arial" w:eastAsia="Arial" w:hAnsi="Arial"/>
+              <w:b w:val="0"/>
+              <w:bCs w:val="0"/>
+              <w:i w:val="0"/>
+              <w:iCs w:val="0"/>
+              <w:smallCaps w:val="0"/>
+              <w:strike w:val="0"/>
               <w:color w:val="000000"/>
+              <w:sz w:val="22"/>
+              <w:szCs w:val="22"/>
               <w:u w:val="none"/>
+              <w:shd w:fill="auto" w:val="clear"/>
+              <w:vertAlign w:val="baseline"/>
             </w:rPr>
           </w:pPr>
           <w:hyperlink w:anchor="_yp1zvr3fhvkq">
@@ -3068,7 +3396,7 @@
               </w:rPr>
               <w:t xml:space="preserve">7. Detalhamento das Interfaces com Usuários</w:t>
               <w:tab/>
-              <w:t xml:space="preserve">12</w:t>
+              <w:t xml:space="preserve">13</w:t>
             </w:r>
           </w:hyperlink>
           <w:r>
@@ -3085,8 +3413,19 @@
             <w:spacing w:line="240" w:lineRule="auto"/>
             <w:ind w:left="720" w:right="0" w:firstLine="0"/>
             <w:rPr>
+              <w:rFonts w:ascii="Arial" w:cs="Arial" w:eastAsia="Arial" w:hAnsi="Arial"/>
+              <w:b w:val="0"/>
+              <w:bCs w:val="0"/>
+              <w:i w:val="0"/>
+              <w:iCs w:val="0"/>
+              <w:smallCaps w:val="0"/>
+              <w:strike w:val="0"/>
               <w:color w:val="000000"/>
+              <w:sz w:val="22"/>
+              <w:szCs w:val="22"/>
               <w:u w:val="none"/>
+              <w:shd w:fill="auto" w:val="clear"/>
+              <w:vertAlign w:val="baseline"/>
             </w:rPr>
           </w:pPr>
           <w:hyperlink w:anchor="_w7vcki9tovm7">
@@ -3107,9 +3446,9 @@
                 <w:vertAlign w:val="baseline"/>
                 <w:rtl w:val="0"/>
               </w:rPr>
-              <w:t xml:space="preserve">7.1. (I01) - Tela de Hemocentros</w:t>
+              <w:t xml:space="preserve">7.1. (I03) - Tela de Hemocentros</w:t>
               <w:tab/>
-              <w:t xml:space="preserve">12</w:t>
+              <w:t xml:space="preserve">13</w:t>
             </w:r>
           </w:hyperlink>
           <w:r>
@@ -3126,8 +3465,19 @@
             <w:spacing w:line="240" w:lineRule="auto"/>
             <w:ind w:left="360" w:right="0" w:firstLine="0"/>
             <w:rPr>
+              <w:rFonts w:ascii="Arial" w:cs="Arial" w:eastAsia="Arial" w:hAnsi="Arial"/>
+              <w:b w:val="0"/>
+              <w:bCs w:val="0"/>
+              <w:i w:val="0"/>
+              <w:iCs w:val="0"/>
+              <w:smallCaps w:val="0"/>
+              <w:strike w:val="0"/>
               <w:color w:val="000000"/>
+              <w:sz w:val="22"/>
+              <w:szCs w:val="22"/>
               <w:u w:val="none"/>
+              <w:shd w:fill="auto" w:val="clear"/>
+              <w:vertAlign w:val="baseline"/>
             </w:rPr>
           </w:pPr>
           <w:hyperlink w:anchor="_smsbw6og4qdn">
@@ -3150,7 +3500,7 @@
               </w:rPr>
               <w:t xml:space="preserve">8. Demais Interfaces</w:t>
               <w:tab/>
-              <w:t xml:space="preserve">13</w:t>
+              <w:t xml:space="preserve">14</w:t>
             </w:r>
           </w:hyperlink>
           <w:r>
@@ -3167,8 +3517,19 @@
             <w:spacing w:line="240" w:lineRule="auto"/>
             <w:ind w:left="720" w:right="0" w:firstLine="0"/>
             <w:rPr>
+              <w:rFonts w:ascii="Arial" w:cs="Arial" w:eastAsia="Arial" w:hAnsi="Arial"/>
+              <w:b w:val="0"/>
+              <w:bCs w:val="0"/>
+              <w:i w:val="0"/>
+              <w:iCs w:val="0"/>
+              <w:smallCaps w:val="0"/>
+              <w:strike w:val="0"/>
               <w:color w:val="000000"/>
+              <w:sz w:val="22"/>
+              <w:szCs w:val="22"/>
               <w:u w:val="none"/>
+              <w:shd w:fill="auto" w:val="clear"/>
+              <w:vertAlign w:val="baseline"/>
             </w:rPr>
           </w:pPr>
           <w:hyperlink w:anchor="_7malqiqrspva">
@@ -3191,7 +3552,7 @@
               </w:rPr>
               <w:t xml:space="preserve">8.1. Interfaces de Software</w:t>
               <w:tab/>
-              <w:t xml:space="preserve">13</w:t>
+              <w:t xml:space="preserve">14</w:t>
             </w:r>
           </w:hyperlink>
           <w:r>
@@ -3208,8 +3569,19 @@
             <w:spacing w:line="240" w:lineRule="auto"/>
             <w:ind w:left="720" w:right="0" w:firstLine="0"/>
             <w:rPr>
+              <w:rFonts w:ascii="Arial" w:cs="Arial" w:eastAsia="Arial" w:hAnsi="Arial"/>
+              <w:b w:val="0"/>
+              <w:bCs w:val="0"/>
+              <w:i w:val="0"/>
+              <w:iCs w:val="0"/>
+              <w:smallCaps w:val="0"/>
+              <w:strike w:val="0"/>
               <w:color w:val="000000"/>
+              <w:sz w:val="22"/>
+              <w:szCs w:val="22"/>
               <w:u w:val="none"/>
+              <w:shd w:fill="auto" w:val="clear"/>
+              <w:vertAlign w:val="baseline"/>
             </w:rPr>
           </w:pPr>
           <w:hyperlink w:anchor="_k2x7jbod14w9">
@@ -3232,7 +3604,7 @@
               </w:rPr>
               <w:t xml:space="preserve">8.2. Interfaces de Hardware</w:t>
               <w:tab/>
-              <w:t xml:space="preserve">13</w:t>
+              <w:t xml:space="preserve">14</w:t>
             </w:r>
           </w:hyperlink>
           <w:r>
@@ -3249,8 +3621,19 @@
             <w:spacing w:line="240" w:lineRule="auto"/>
             <w:ind w:left="360" w:right="0" w:firstLine="0"/>
             <w:rPr>
+              <w:rFonts w:ascii="Arial" w:cs="Arial" w:eastAsia="Arial" w:hAnsi="Arial"/>
+              <w:b w:val="0"/>
+              <w:bCs w:val="0"/>
+              <w:i w:val="0"/>
+              <w:iCs w:val="0"/>
+              <w:smallCaps w:val="0"/>
+              <w:strike w:val="0"/>
               <w:color w:val="000000"/>
+              <w:sz w:val="22"/>
+              <w:szCs w:val="22"/>
               <w:u w:val="none"/>
+              <w:shd w:fill="auto" w:val="clear"/>
+              <w:vertAlign w:val="baseline"/>
             </w:rPr>
           </w:pPr>
           <w:hyperlink w:anchor="_x2sjedp829rl">
@@ -3273,7 +3656,7 @@
               </w:rPr>
               <w:t xml:space="preserve">9. Observações</w:t>
               <w:tab/>
-              <w:t xml:space="preserve">13</w:t>
+              <w:t xml:space="preserve">14</w:t>
             </w:r>
           </w:hyperlink>
           <w:r>
@@ -3290,24 +3673,42 @@
             <w:spacing w:line="240" w:lineRule="auto"/>
             <w:ind w:left="0" w:right="0" w:firstLine="0"/>
             <w:rPr>
+              <w:rFonts w:ascii="Arial" w:cs="Arial" w:eastAsia="Arial" w:hAnsi="Arial"/>
               <w:b w:val="1"/>
               <w:bCs w:val="1"/>
+              <w:i w:val="0"/>
+              <w:iCs w:val="0"/>
+              <w:smallCaps w:val="0"/>
+              <w:strike w:val="0"/>
               <w:color w:val="000000"/>
+              <w:sz w:val="22"/>
+              <w:szCs w:val="22"/>
               <w:u w:val="none"/>
+              <w:shd w:fill="auto" w:val="clear"/>
+              <w:vertAlign w:val="baseline"/>
             </w:rPr>
           </w:pPr>
           <w:hyperlink w:anchor="_v4vq99hxbhdd">
             <w:r>
               <w:rPr>
+                <w:rFonts w:ascii="Arial" w:cs="Arial" w:eastAsia="Arial" w:hAnsi="Arial"/>
                 <w:b w:val="1"/>
                 <w:bCs w:val="1"/>
+                <w:i w:val="0"/>
+                <w:iCs w:val="0"/>
+                <w:smallCaps w:val="0"/>
+                <w:strike w:val="0"/>
                 <w:color w:val="000000"/>
+                <w:sz w:val="22"/>
+                <w:szCs w:val="22"/>
                 <w:u w:val="none"/>
+                <w:shd w:fill="auto" w:val="clear"/>
+                <w:vertAlign w:val="baseline"/>
                 <w:rtl w:val="0"/>
               </w:rPr>
               <w:t xml:space="preserve">Especificação de Caso de Uso: Visualizar histórico de doações</w:t>
               <w:tab/>
-              <w:t xml:space="preserve">14</w:t>
+              <w:t xml:space="preserve">15</w:t>
             </w:r>
           </w:hyperlink>
           <w:r>
@@ -3324,20 +3725,42 @@
             <w:spacing w:line="240" w:lineRule="auto"/>
             <w:ind w:left="360" w:right="0" w:firstLine="0"/>
             <w:rPr>
+              <w:rFonts w:ascii="Arial" w:cs="Arial" w:eastAsia="Arial" w:hAnsi="Arial"/>
+              <w:b w:val="0"/>
+              <w:bCs w:val="0"/>
+              <w:i w:val="0"/>
+              <w:iCs w:val="0"/>
+              <w:smallCaps w:val="0"/>
+              <w:strike w:val="0"/>
               <w:color w:val="000000"/>
+              <w:sz w:val="22"/>
+              <w:szCs w:val="22"/>
               <w:u w:val="none"/>
+              <w:shd w:fill="auto" w:val="clear"/>
+              <w:vertAlign w:val="baseline"/>
             </w:rPr>
           </w:pPr>
           <w:hyperlink w:anchor="_gvgr75hroxj">
             <w:r>
               <w:rPr>
+                <w:rFonts w:ascii="Arial" w:cs="Arial" w:eastAsia="Arial" w:hAnsi="Arial"/>
+                <w:b w:val="0"/>
+                <w:bCs w:val="0"/>
+                <w:i w:val="0"/>
+                <w:iCs w:val="0"/>
+                <w:smallCaps w:val="0"/>
+                <w:strike w:val="0"/>
                 <w:color w:val="000000"/>
+                <w:sz w:val="22"/>
+                <w:szCs w:val="22"/>
                 <w:u w:val="none"/>
+                <w:shd w:fill="auto" w:val="clear"/>
+                <w:vertAlign w:val="baseline"/>
                 <w:rtl w:val="0"/>
               </w:rPr>
               <w:t xml:space="preserve">1. Descrição</w:t>
               <w:tab/>
-              <w:t xml:space="preserve">14</w:t>
+              <w:t xml:space="preserve">15</w:t>
             </w:r>
           </w:hyperlink>
           <w:r>
@@ -3354,20 +3777,42 @@
             <w:spacing w:line="240" w:lineRule="auto"/>
             <w:ind w:left="360" w:right="0" w:firstLine="0"/>
             <w:rPr>
+              <w:rFonts w:ascii="Arial" w:cs="Arial" w:eastAsia="Arial" w:hAnsi="Arial"/>
+              <w:b w:val="0"/>
+              <w:bCs w:val="0"/>
+              <w:i w:val="0"/>
+              <w:iCs w:val="0"/>
+              <w:smallCaps w:val="0"/>
+              <w:strike w:val="0"/>
               <w:color w:val="000000"/>
+              <w:sz w:val="22"/>
+              <w:szCs w:val="22"/>
               <w:u w:val="none"/>
+              <w:shd w:fill="auto" w:val="clear"/>
+              <w:vertAlign w:val="baseline"/>
             </w:rPr>
           </w:pPr>
           <w:hyperlink w:anchor="_f6mnlrr1xqjy">
             <w:r>
               <w:rPr>
+                <w:rFonts w:ascii="Arial" w:cs="Arial" w:eastAsia="Arial" w:hAnsi="Arial"/>
+                <w:b w:val="0"/>
+                <w:bCs w:val="0"/>
+                <w:i w:val="0"/>
+                <w:iCs w:val="0"/>
+                <w:smallCaps w:val="0"/>
+                <w:strike w:val="0"/>
                 <w:color w:val="000000"/>
+                <w:sz w:val="22"/>
+                <w:szCs w:val="22"/>
                 <w:u w:val="none"/>
+                <w:shd w:fill="auto" w:val="clear"/>
+                <w:vertAlign w:val="baseline"/>
                 <w:rtl w:val="0"/>
               </w:rPr>
               <w:t xml:space="preserve">2. Pré-condições</w:t>
               <w:tab/>
-              <w:t xml:space="preserve">14</w:t>
+              <w:t xml:space="preserve">15</w:t>
             </w:r>
           </w:hyperlink>
           <w:r>
@@ -3384,20 +3829,42 @@
             <w:spacing w:line="240" w:lineRule="auto"/>
             <w:ind w:left="360" w:right="0" w:firstLine="0"/>
             <w:rPr>
+              <w:rFonts w:ascii="Arial" w:cs="Arial" w:eastAsia="Arial" w:hAnsi="Arial"/>
+              <w:b w:val="0"/>
+              <w:bCs w:val="0"/>
+              <w:i w:val="0"/>
+              <w:iCs w:val="0"/>
+              <w:smallCaps w:val="0"/>
+              <w:strike w:val="0"/>
               <w:color w:val="000000"/>
+              <w:sz w:val="22"/>
+              <w:szCs w:val="22"/>
               <w:u w:val="none"/>
+              <w:shd w:fill="auto" w:val="clear"/>
+              <w:vertAlign w:val="baseline"/>
             </w:rPr>
           </w:pPr>
           <w:hyperlink w:anchor="_nsuflqlw0cl">
             <w:r>
               <w:rPr>
+                <w:rFonts w:ascii="Arial" w:cs="Arial" w:eastAsia="Arial" w:hAnsi="Arial"/>
+                <w:b w:val="0"/>
+                <w:bCs w:val="0"/>
+                <w:i w:val="0"/>
+                <w:iCs w:val="0"/>
+                <w:smallCaps w:val="0"/>
+                <w:strike w:val="0"/>
                 <w:color w:val="000000"/>
+                <w:sz w:val="22"/>
+                <w:szCs w:val="22"/>
                 <w:u w:val="none"/>
+                <w:shd w:fill="auto" w:val="clear"/>
+                <w:vertAlign w:val="baseline"/>
                 <w:rtl w:val="0"/>
               </w:rPr>
               <w:t xml:space="preserve">3. Fluxo de Eventos</w:t>
               <w:tab/>
-              <w:t xml:space="preserve">14</w:t>
+              <w:t xml:space="preserve">15</w:t>
             </w:r>
           </w:hyperlink>
           <w:r>
@@ -3414,20 +3881,42 @@
             <w:spacing w:line="240" w:lineRule="auto"/>
             <w:ind w:left="720" w:right="0" w:firstLine="0"/>
             <w:rPr>
+              <w:rFonts w:ascii="Arial" w:cs="Arial" w:eastAsia="Arial" w:hAnsi="Arial"/>
+              <w:b w:val="0"/>
+              <w:bCs w:val="0"/>
+              <w:i w:val="0"/>
+              <w:iCs w:val="0"/>
+              <w:smallCaps w:val="0"/>
+              <w:strike w:val="0"/>
               <w:color w:val="000000"/>
+              <w:sz w:val="22"/>
+              <w:szCs w:val="22"/>
               <w:u w:val="none"/>
+              <w:shd w:fill="auto" w:val="clear"/>
+              <w:vertAlign w:val="baseline"/>
             </w:rPr>
           </w:pPr>
           <w:hyperlink w:anchor="_31zdy1enxb4i">
             <w:r>
               <w:rPr>
+                <w:rFonts w:ascii="Arial" w:cs="Arial" w:eastAsia="Arial" w:hAnsi="Arial"/>
+                <w:b w:val="0"/>
+                <w:bCs w:val="0"/>
+                <w:i w:val="0"/>
+                <w:iCs w:val="0"/>
+                <w:smallCaps w:val="0"/>
+                <w:strike w:val="0"/>
                 <w:color w:val="000000"/>
+                <w:sz w:val="22"/>
+                <w:szCs w:val="22"/>
                 <w:u w:val="none"/>
+                <w:shd w:fill="auto" w:val="clear"/>
+                <w:vertAlign w:val="baseline"/>
                 <w:rtl w:val="0"/>
               </w:rPr>
               <w:t xml:space="preserve">3.1. Fluxo Básico</w:t>
               <w:tab/>
-              <w:t xml:space="preserve">14</w:t>
+              <w:t xml:space="preserve">15</w:t>
             </w:r>
           </w:hyperlink>
           <w:r>
@@ -3444,20 +3933,42 @@
             <w:spacing w:line="240" w:lineRule="auto"/>
             <w:ind w:left="720" w:right="0" w:firstLine="0"/>
             <w:rPr>
+              <w:rFonts w:ascii="Arial" w:cs="Arial" w:eastAsia="Arial" w:hAnsi="Arial"/>
+              <w:b w:val="0"/>
+              <w:bCs w:val="0"/>
+              <w:i w:val="0"/>
+              <w:iCs w:val="0"/>
+              <w:smallCaps w:val="0"/>
+              <w:strike w:val="0"/>
               <w:color w:val="000000"/>
+              <w:sz w:val="22"/>
+              <w:szCs w:val="22"/>
               <w:u w:val="none"/>
+              <w:shd w:fill="auto" w:val="clear"/>
+              <w:vertAlign w:val="baseline"/>
             </w:rPr>
           </w:pPr>
           <w:hyperlink w:anchor="_1q6faiszcvqm">
             <w:r>
               <w:rPr>
+                <w:rFonts w:ascii="Arial" w:cs="Arial" w:eastAsia="Arial" w:hAnsi="Arial"/>
+                <w:b w:val="0"/>
+                <w:bCs w:val="0"/>
+                <w:i w:val="0"/>
+                <w:iCs w:val="0"/>
+                <w:smallCaps w:val="0"/>
+                <w:strike w:val="0"/>
                 <w:color w:val="000000"/>
+                <w:sz w:val="22"/>
+                <w:szCs w:val="22"/>
                 <w:u w:val="none"/>
+                <w:shd w:fill="auto" w:val="clear"/>
+                <w:vertAlign w:val="baseline"/>
                 <w:rtl w:val="0"/>
               </w:rPr>
               <w:t xml:space="preserve">3.2. Subfluxos</w:t>
               <w:tab/>
-              <w:t xml:space="preserve">14</w:t>
+              <w:t xml:space="preserve">15</w:t>
             </w:r>
           </w:hyperlink>
           <w:r>
@@ -3474,20 +3985,42 @@
             <w:spacing w:line="240" w:lineRule="auto"/>
             <w:ind w:left="1080" w:right="0" w:firstLine="0"/>
             <w:rPr>
+              <w:rFonts w:ascii="Arial" w:cs="Arial" w:eastAsia="Arial" w:hAnsi="Arial"/>
+              <w:b w:val="0"/>
+              <w:bCs w:val="0"/>
+              <w:i w:val="0"/>
+              <w:iCs w:val="0"/>
+              <w:smallCaps w:val="0"/>
+              <w:strike w:val="0"/>
               <w:color w:val="000000"/>
+              <w:sz w:val="22"/>
+              <w:szCs w:val="22"/>
               <w:u w:val="none"/>
+              <w:shd w:fill="auto" w:val="clear"/>
+              <w:vertAlign w:val="baseline"/>
             </w:rPr>
           </w:pPr>
           <w:hyperlink w:anchor="_kwiar8jiozm2">
             <w:r>
               <w:rPr>
+                <w:rFonts w:ascii="Arial" w:cs="Arial" w:eastAsia="Arial" w:hAnsi="Arial"/>
+                <w:b w:val="0"/>
+                <w:bCs w:val="0"/>
+                <w:i w:val="0"/>
+                <w:iCs w:val="0"/>
+                <w:smallCaps w:val="0"/>
+                <w:strike w:val="0"/>
                 <w:color w:val="000000"/>
+                <w:sz w:val="22"/>
+                <w:szCs w:val="22"/>
                 <w:u w:val="none"/>
-                <w:rtl w:val="0"/>
-              </w:rPr>
-              <w:t xml:space="preserve">3.2.1. (S01) – Filtrar histórico de doações</w:t>
+                <w:shd w:fill="auto" w:val="clear"/>
+                <w:vertAlign w:val="baseline"/>
+                <w:rtl w:val="0"/>
+              </w:rPr>
+              <w:t xml:space="preserve">3.2.1. (S03) – Filtrar histórico de doações</w:t>
               <w:tab/>
-              <w:t xml:space="preserve">14</w:t>
+              <w:t xml:space="preserve">15</w:t>
             </w:r>
           </w:hyperlink>
           <w:r>
@@ -3504,20 +4037,42 @@
             <w:spacing w:line="240" w:lineRule="auto"/>
             <w:ind w:left="720" w:right="0" w:firstLine="0"/>
             <w:rPr>
+              <w:rFonts w:ascii="Arial" w:cs="Arial" w:eastAsia="Arial" w:hAnsi="Arial"/>
+              <w:b w:val="0"/>
+              <w:bCs w:val="0"/>
+              <w:i w:val="0"/>
+              <w:iCs w:val="0"/>
+              <w:smallCaps w:val="0"/>
+              <w:strike w:val="0"/>
               <w:color w:val="000000"/>
+              <w:sz w:val="22"/>
+              <w:szCs w:val="22"/>
               <w:u w:val="none"/>
+              <w:shd w:fill="auto" w:val="clear"/>
+              <w:vertAlign w:val="baseline"/>
             </w:rPr>
           </w:pPr>
           <w:hyperlink w:anchor="_60sglesq7hwt">
             <w:r>
               <w:rPr>
+                <w:rFonts w:ascii="Arial" w:cs="Arial" w:eastAsia="Arial" w:hAnsi="Arial"/>
+                <w:b w:val="0"/>
+                <w:bCs w:val="0"/>
+                <w:i w:val="0"/>
+                <w:iCs w:val="0"/>
+                <w:smallCaps w:val="0"/>
+                <w:strike w:val="0"/>
                 <w:color w:val="000000"/>
+                <w:sz w:val="22"/>
+                <w:szCs w:val="22"/>
                 <w:u w:val="none"/>
+                <w:shd w:fill="auto" w:val="clear"/>
+                <w:vertAlign w:val="baseline"/>
                 <w:rtl w:val="0"/>
               </w:rPr>
               <w:t xml:space="preserve">3.3. Fluxos Alternativos</w:t>
               <w:tab/>
-              <w:t xml:space="preserve">15</w:t>
+              <w:t xml:space="preserve">16</w:t>
             </w:r>
           </w:hyperlink>
           <w:r>
@@ -3534,20 +4089,42 @@
             <w:spacing w:line="240" w:lineRule="auto"/>
             <w:ind w:left="1080" w:right="0" w:firstLine="0"/>
             <w:rPr>
+              <w:rFonts w:ascii="Arial" w:cs="Arial" w:eastAsia="Arial" w:hAnsi="Arial"/>
+              <w:b w:val="0"/>
+              <w:bCs w:val="0"/>
+              <w:i w:val="0"/>
+              <w:iCs w:val="0"/>
+              <w:smallCaps w:val="0"/>
+              <w:strike w:val="0"/>
               <w:color w:val="000000"/>
+              <w:sz w:val="22"/>
+              <w:szCs w:val="22"/>
               <w:u w:val="none"/>
+              <w:shd w:fill="auto" w:val="clear"/>
+              <w:vertAlign w:val="baseline"/>
             </w:rPr>
           </w:pPr>
           <w:hyperlink w:anchor="_d9sbjq4al57h">
             <w:r>
               <w:rPr>
+                <w:rFonts w:ascii="Arial" w:cs="Arial" w:eastAsia="Arial" w:hAnsi="Arial"/>
+                <w:b w:val="0"/>
+                <w:bCs w:val="0"/>
+                <w:i w:val="0"/>
+                <w:iCs w:val="0"/>
+                <w:smallCaps w:val="0"/>
+                <w:strike w:val="0"/>
                 <w:color w:val="000000"/>
+                <w:sz w:val="22"/>
+                <w:szCs w:val="22"/>
                 <w:u w:val="none"/>
-                <w:rtl w:val="0"/>
-              </w:rPr>
-              <w:t xml:space="preserve">3.3.1. (A01) – Histórico vazio</w:t>
+                <w:shd w:fill="auto" w:val="clear"/>
+                <w:vertAlign w:val="baseline"/>
+                <w:rtl w:val="0"/>
+              </w:rPr>
+              <w:t xml:space="preserve">3.3.1. (A03) – Histórico vazio</w:t>
               <w:tab/>
-              <w:t xml:space="preserve">15</w:t>
+              <w:t xml:space="preserve">16</w:t>
             </w:r>
           </w:hyperlink>
           <w:r>
@@ -3564,20 +4141,42 @@
             <w:spacing w:line="240" w:lineRule="auto"/>
             <w:ind w:left="360" w:right="0" w:firstLine="0"/>
             <w:rPr>
+              <w:rFonts w:ascii="Arial" w:cs="Arial" w:eastAsia="Arial" w:hAnsi="Arial"/>
+              <w:b w:val="0"/>
+              <w:bCs w:val="0"/>
+              <w:i w:val="0"/>
+              <w:iCs w:val="0"/>
+              <w:smallCaps w:val="0"/>
+              <w:strike w:val="0"/>
               <w:color w:val="000000"/>
+              <w:sz w:val="22"/>
+              <w:szCs w:val="22"/>
               <w:u w:val="none"/>
+              <w:shd w:fill="auto" w:val="clear"/>
+              <w:vertAlign w:val="baseline"/>
             </w:rPr>
           </w:pPr>
           <w:hyperlink w:anchor="_6scgg0ii4c71">
             <w:r>
               <w:rPr>
+                <w:rFonts w:ascii="Arial" w:cs="Arial" w:eastAsia="Arial" w:hAnsi="Arial"/>
+                <w:b w:val="0"/>
+                <w:bCs w:val="0"/>
+                <w:i w:val="0"/>
+                <w:iCs w:val="0"/>
+                <w:smallCaps w:val="0"/>
+                <w:strike w:val="0"/>
                 <w:color w:val="000000"/>
+                <w:sz w:val="22"/>
+                <w:szCs w:val="22"/>
                 <w:u w:val="none"/>
+                <w:shd w:fill="auto" w:val="clear"/>
+                <w:vertAlign w:val="baseline"/>
                 <w:rtl w:val="0"/>
               </w:rPr>
               <w:t xml:space="preserve">3.4. Exceções</w:t>
               <w:tab/>
-              <w:t xml:space="preserve">15</w:t>
+              <w:t xml:space="preserve">16</w:t>
             </w:r>
           </w:hyperlink>
           <w:r>
@@ -3594,20 +4193,42 @@
             <w:spacing w:line="240" w:lineRule="auto"/>
             <w:ind w:left="1080" w:right="0" w:firstLine="0"/>
             <w:rPr>
+              <w:rFonts w:ascii="Arial" w:cs="Arial" w:eastAsia="Arial" w:hAnsi="Arial"/>
+              <w:b w:val="0"/>
+              <w:bCs w:val="0"/>
+              <w:i w:val="0"/>
+              <w:iCs w:val="0"/>
+              <w:smallCaps w:val="0"/>
+              <w:strike w:val="0"/>
               <w:color w:val="000000"/>
+              <w:sz w:val="22"/>
+              <w:szCs w:val="22"/>
               <w:u w:val="none"/>
+              <w:shd w:fill="auto" w:val="clear"/>
+              <w:vertAlign w:val="baseline"/>
             </w:rPr>
           </w:pPr>
           <w:hyperlink w:anchor="_s5ax3f1tfb2f">
             <w:r>
               <w:rPr>
+                <w:rFonts w:ascii="Arial" w:cs="Arial" w:eastAsia="Arial" w:hAnsi="Arial"/>
+                <w:b w:val="0"/>
+                <w:bCs w:val="0"/>
+                <w:i w:val="0"/>
+                <w:iCs w:val="0"/>
+                <w:smallCaps w:val="0"/>
+                <w:strike w:val="0"/>
                 <w:color w:val="000000"/>
+                <w:sz w:val="22"/>
+                <w:szCs w:val="22"/>
                 <w:u w:val="none"/>
-                <w:rtl w:val="0"/>
-              </w:rPr>
-              <w:t xml:space="preserve">3.4.1. (E01) – Usuário não autenticado</w:t>
+                <w:shd w:fill="auto" w:val="clear"/>
+                <w:vertAlign w:val="baseline"/>
+                <w:rtl w:val="0"/>
+              </w:rPr>
+              <w:t xml:space="preserve">3.4.1. (E06) – Usuário não autenticado</w:t>
               <w:tab/>
-              <w:t xml:space="preserve">15</w:t>
+              <w:t xml:space="preserve">16</w:t>
             </w:r>
           </w:hyperlink>
           <w:r>
@@ -3624,20 +4245,42 @@
             <w:spacing w:line="240" w:lineRule="auto"/>
             <w:ind w:left="360" w:right="0" w:firstLine="0"/>
             <w:rPr>
+              <w:rFonts w:ascii="Arial" w:cs="Arial" w:eastAsia="Arial" w:hAnsi="Arial"/>
+              <w:b w:val="0"/>
+              <w:bCs w:val="0"/>
+              <w:i w:val="0"/>
+              <w:iCs w:val="0"/>
+              <w:smallCaps w:val="0"/>
+              <w:strike w:val="0"/>
               <w:color w:val="000000"/>
+              <w:sz w:val="22"/>
+              <w:szCs w:val="22"/>
               <w:u w:val="none"/>
+              <w:shd w:fill="auto" w:val="clear"/>
+              <w:vertAlign w:val="baseline"/>
             </w:rPr>
           </w:pPr>
           <w:hyperlink w:anchor="_ym9mhlhukph">
             <w:r>
               <w:rPr>
+                <w:rFonts w:ascii="Arial" w:cs="Arial" w:eastAsia="Arial" w:hAnsi="Arial"/>
+                <w:b w:val="0"/>
+                <w:bCs w:val="0"/>
+                <w:i w:val="0"/>
+                <w:iCs w:val="0"/>
+                <w:smallCaps w:val="0"/>
+                <w:strike w:val="0"/>
                 <w:color w:val="000000"/>
+                <w:sz w:val="22"/>
+                <w:szCs w:val="22"/>
                 <w:u w:val="none"/>
+                <w:shd w:fill="auto" w:val="clear"/>
+                <w:vertAlign w:val="baseline"/>
                 <w:rtl w:val="0"/>
               </w:rPr>
               <w:t xml:space="preserve">4. Pós-condições</w:t>
               <w:tab/>
-              <w:t xml:space="preserve">15</w:t>
+              <w:t xml:space="preserve">16</w:t>
             </w:r>
           </w:hyperlink>
           <w:r>
@@ -3654,20 +4297,42 @@
             <w:spacing w:line="240" w:lineRule="auto"/>
             <w:ind w:left="360" w:right="0" w:firstLine="0"/>
             <w:rPr>
+              <w:rFonts w:ascii="Arial" w:cs="Arial" w:eastAsia="Arial" w:hAnsi="Arial"/>
+              <w:b w:val="0"/>
+              <w:bCs w:val="0"/>
+              <w:i w:val="0"/>
+              <w:iCs w:val="0"/>
+              <w:smallCaps w:val="0"/>
+              <w:strike w:val="0"/>
               <w:color w:val="000000"/>
+              <w:sz w:val="22"/>
+              <w:szCs w:val="22"/>
               <w:u w:val="none"/>
+              <w:shd w:fill="auto" w:val="clear"/>
+              <w:vertAlign w:val="baseline"/>
             </w:rPr>
           </w:pPr>
           <w:hyperlink w:anchor="_9aul31wbwy6d">
             <w:r>
               <w:rPr>
+                <w:rFonts w:ascii="Arial" w:cs="Arial" w:eastAsia="Arial" w:hAnsi="Arial"/>
+                <w:b w:val="0"/>
+                <w:bCs w:val="0"/>
+                <w:i w:val="0"/>
+                <w:iCs w:val="0"/>
+                <w:smallCaps w:val="0"/>
+                <w:strike w:val="0"/>
                 <w:color w:val="000000"/>
+                <w:sz w:val="22"/>
+                <w:szCs w:val="22"/>
                 <w:u w:val="none"/>
+                <w:shd w:fill="auto" w:val="clear"/>
+                <w:vertAlign w:val="baseline"/>
                 <w:rtl w:val="0"/>
               </w:rPr>
               <w:t xml:space="preserve">5. Requisitos Especiais</w:t>
               <w:tab/>
-              <w:t xml:space="preserve">15</w:t>
+              <w:t xml:space="preserve">16</w:t>
             </w:r>
           </w:hyperlink>
           <w:r>
@@ -3684,20 +4349,42 @@
             <w:spacing w:line="240" w:lineRule="auto"/>
             <w:ind w:left="360" w:right="0" w:firstLine="0"/>
             <w:rPr>
+              <w:rFonts w:ascii="Arial" w:cs="Arial" w:eastAsia="Arial" w:hAnsi="Arial"/>
+              <w:b w:val="0"/>
+              <w:bCs w:val="0"/>
+              <w:i w:val="0"/>
+              <w:iCs w:val="0"/>
+              <w:smallCaps w:val="0"/>
+              <w:strike w:val="0"/>
               <w:color w:val="000000"/>
+              <w:sz w:val="22"/>
+              <w:szCs w:val="22"/>
               <w:u w:val="none"/>
+              <w:shd w:fill="auto" w:val="clear"/>
+              <w:vertAlign w:val="baseline"/>
             </w:rPr>
           </w:pPr>
           <w:hyperlink w:anchor="_pbw2mx8s5jc2">
             <w:r>
               <w:rPr>
+                <w:rFonts w:ascii="Arial" w:cs="Arial" w:eastAsia="Arial" w:hAnsi="Arial"/>
+                <w:b w:val="0"/>
+                <w:bCs w:val="0"/>
+                <w:i w:val="0"/>
+                <w:iCs w:val="0"/>
+                <w:smallCaps w:val="0"/>
+                <w:strike w:val="0"/>
                 <w:color w:val="000000"/>
+                <w:sz w:val="22"/>
+                <w:szCs w:val="22"/>
                 <w:u w:val="none"/>
+                <w:shd w:fill="auto" w:val="clear"/>
+                <w:vertAlign w:val="baseline"/>
                 <w:rtl w:val="0"/>
               </w:rPr>
               <w:t xml:space="preserve">6. Regras de negócio específicas</w:t>
               <w:tab/>
-              <w:t xml:space="preserve">15</w:t>
+              <w:t xml:space="preserve">16</w:t>
             </w:r>
           </w:hyperlink>
           <w:r>
@@ -3714,20 +4401,42 @@
             <w:spacing w:line="240" w:lineRule="auto"/>
             <w:ind w:left="360" w:right="0" w:firstLine="0"/>
             <w:rPr>
+              <w:rFonts w:ascii="Arial" w:cs="Arial" w:eastAsia="Arial" w:hAnsi="Arial"/>
+              <w:b w:val="0"/>
+              <w:bCs w:val="0"/>
+              <w:i w:val="0"/>
+              <w:iCs w:val="0"/>
+              <w:smallCaps w:val="0"/>
+              <w:strike w:val="0"/>
               <w:color w:val="000000"/>
+              <w:sz w:val="22"/>
+              <w:szCs w:val="22"/>
               <w:u w:val="none"/>
+              <w:shd w:fill="auto" w:val="clear"/>
+              <w:vertAlign w:val="baseline"/>
             </w:rPr>
           </w:pPr>
           <w:hyperlink w:anchor="_e4nf98bry8bd">
             <w:r>
               <w:rPr>
+                <w:rFonts w:ascii="Arial" w:cs="Arial" w:eastAsia="Arial" w:hAnsi="Arial"/>
+                <w:b w:val="0"/>
+                <w:bCs w:val="0"/>
+                <w:i w:val="0"/>
+                <w:iCs w:val="0"/>
+                <w:smallCaps w:val="0"/>
+                <w:strike w:val="0"/>
                 <w:color w:val="000000"/>
+                <w:sz w:val="22"/>
+                <w:szCs w:val="22"/>
                 <w:u w:val="none"/>
+                <w:shd w:fill="auto" w:val="clear"/>
+                <w:vertAlign w:val="baseline"/>
                 <w:rtl w:val="0"/>
               </w:rPr>
               <w:t xml:space="preserve">7. Detalhamento das Interfaces com Usuários</w:t>
               <w:tab/>
-              <w:t xml:space="preserve">16</w:t>
+              <w:t xml:space="preserve">17</w:t>
             </w:r>
           </w:hyperlink>
           <w:r>
@@ -3744,20 +4453,42 @@
             <w:spacing w:line="240" w:lineRule="auto"/>
             <w:ind w:left="720" w:right="0" w:firstLine="0"/>
             <w:rPr>
+              <w:rFonts w:ascii="Arial" w:cs="Arial" w:eastAsia="Arial" w:hAnsi="Arial"/>
+              <w:b w:val="0"/>
+              <w:bCs w:val="0"/>
+              <w:i w:val="0"/>
+              <w:iCs w:val="0"/>
+              <w:smallCaps w:val="0"/>
+              <w:strike w:val="0"/>
               <w:color w:val="000000"/>
+              <w:sz w:val="22"/>
+              <w:szCs w:val="22"/>
               <w:u w:val="none"/>
+              <w:shd w:fill="auto" w:val="clear"/>
+              <w:vertAlign w:val="baseline"/>
             </w:rPr>
           </w:pPr>
           <w:hyperlink w:anchor="_x1mpcioace4u">
             <w:r>
               <w:rPr>
+                <w:rFonts w:ascii="Arial" w:cs="Arial" w:eastAsia="Arial" w:hAnsi="Arial"/>
+                <w:b w:val="0"/>
+                <w:bCs w:val="0"/>
+                <w:i w:val="0"/>
+                <w:iCs w:val="0"/>
+                <w:smallCaps w:val="0"/>
+                <w:strike w:val="0"/>
                 <w:color w:val="000000"/>
+                <w:sz w:val="22"/>
+                <w:szCs w:val="22"/>
                 <w:u w:val="none"/>
-                <w:rtl w:val="0"/>
-              </w:rPr>
-              <w:t xml:space="preserve">7.1. (I01) - Tela de Histórico de Doações</w:t>
+                <w:shd w:fill="auto" w:val="clear"/>
+                <w:vertAlign w:val="baseline"/>
+                <w:rtl w:val="0"/>
+              </w:rPr>
+              <w:t xml:space="preserve">7.1. (I04) - Tela de Histórico de Doações</w:t>
               <w:tab/>
-              <w:t xml:space="preserve">16</w:t>
+              <w:t xml:space="preserve">17</w:t>
             </w:r>
           </w:hyperlink>
           <w:r>
@@ -3774,20 +4505,42 @@
             <w:spacing w:line="240" w:lineRule="auto"/>
             <w:ind w:left="360" w:right="0" w:firstLine="0"/>
             <w:rPr>
+              <w:rFonts w:ascii="Arial" w:cs="Arial" w:eastAsia="Arial" w:hAnsi="Arial"/>
+              <w:b w:val="0"/>
+              <w:bCs w:val="0"/>
+              <w:i w:val="0"/>
+              <w:iCs w:val="0"/>
+              <w:smallCaps w:val="0"/>
+              <w:strike w:val="0"/>
               <w:color w:val="000000"/>
+              <w:sz w:val="22"/>
+              <w:szCs w:val="22"/>
               <w:u w:val="none"/>
+              <w:shd w:fill="auto" w:val="clear"/>
+              <w:vertAlign w:val="baseline"/>
             </w:rPr>
           </w:pPr>
           <w:hyperlink w:anchor="_598gowcb4hi2">
             <w:r>
               <w:rPr>
+                <w:rFonts w:ascii="Arial" w:cs="Arial" w:eastAsia="Arial" w:hAnsi="Arial"/>
+                <w:b w:val="0"/>
+                <w:bCs w:val="0"/>
+                <w:i w:val="0"/>
+                <w:iCs w:val="0"/>
+                <w:smallCaps w:val="0"/>
+                <w:strike w:val="0"/>
                 <w:color w:val="000000"/>
+                <w:sz w:val="22"/>
+                <w:szCs w:val="22"/>
                 <w:u w:val="none"/>
+                <w:shd w:fill="auto" w:val="clear"/>
+                <w:vertAlign w:val="baseline"/>
                 <w:rtl w:val="0"/>
               </w:rPr>
               <w:t xml:space="preserve">8. Demais Interfaces</w:t>
               <w:tab/>
-              <w:t xml:space="preserve">16</w:t>
+              <w:t xml:space="preserve">17</w:t>
             </w:r>
           </w:hyperlink>
           <w:r>
@@ -3804,20 +4557,42 @@
             <w:spacing w:line="240" w:lineRule="auto"/>
             <w:ind w:left="360" w:right="0" w:firstLine="0"/>
             <w:rPr>
+              <w:rFonts w:ascii="Arial" w:cs="Arial" w:eastAsia="Arial" w:hAnsi="Arial"/>
+              <w:b w:val="0"/>
+              <w:bCs w:val="0"/>
+              <w:i w:val="0"/>
+              <w:iCs w:val="0"/>
+              <w:smallCaps w:val="0"/>
+              <w:strike w:val="0"/>
               <w:color w:val="000000"/>
+              <w:sz w:val="22"/>
+              <w:szCs w:val="22"/>
               <w:u w:val="none"/>
+              <w:shd w:fill="auto" w:val="clear"/>
+              <w:vertAlign w:val="baseline"/>
             </w:rPr>
           </w:pPr>
           <w:hyperlink w:anchor="_z3k0j0tzsfk4">
             <w:r>
               <w:rPr>
+                <w:rFonts w:ascii="Arial" w:cs="Arial" w:eastAsia="Arial" w:hAnsi="Arial"/>
+                <w:b w:val="0"/>
+                <w:bCs w:val="0"/>
+                <w:i w:val="0"/>
+                <w:iCs w:val="0"/>
+                <w:smallCaps w:val="0"/>
+                <w:strike w:val="0"/>
                 <w:color w:val="000000"/>
+                <w:sz w:val="22"/>
+                <w:szCs w:val="22"/>
                 <w:u w:val="none"/>
+                <w:shd w:fill="auto" w:val="clear"/>
+                <w:vertAlign w:val="baseline"/>
                 <w:rtl w:val="0"/>
               </w:rPr>
               <w:t xml:space="preserve">9. Observações</w:t>
               <w:tab/>
-              <w:t xml:space="preserve">17</w:t>
+              <w:t xml:space="preserve">18</w:t>
             </w:r>
           </w:hyperlink>
           <w:r>
@@ -4258,7 +5033,7 @@
         <w:rPr>
           <w:rtl w:val="0"/>
         </w:rPr>
-        <w:t xml:space="preserve">(A01) – Hemocentro sem vagas no horário selecionado</w:t>
+        <w:t xml:space="preserve">(S01) – Hemocentro sem vagas no horário selecionado</w:t>
       </w:r>
     </w:p>
     <w:p>
@@ -5246,12 +6021,12 @@
           <wp:inline distB="0" distT="0" distL="0" distR="0">
             <wp:extent cx="2199591" cy="4767262"/>
             <wp:effectExtent b="0" l="0" r="0" t="0"/>
-            <wp:docPr id="1" name="image1.png"/>
+            <wp:docPr id="1" name="image2.png"/>
             <a:graphic>
               <a:graphicData uri="http://schemas.openxmlformats.org/drawingml/2006/picture">
                 <pic:pic>
                   <pic:nvPicPr>
-                    <pic:cNvPr id="0" name="image1.png"/>
+                    <pic:cNvPr id="0" name="image2.png"/>
                     <pic:cNvPicPr preferRelativeResize="0"/>
                   </pic:nvPicPr>
                   <pic:blipFill>
@@ -7907,7 +8682,20 @@
           <w:vertAlign w:val="baseline"/>
           <w:rtl w:val="0"/>
         </w:rPr>
-        <w:t xml:space="preserve">(S01) – Validação de Força da Senha</w:t>
+        <w:t xml:space="preserve">(S0</w:t>
+      </w:r>
+      <w:r>
+        <w:rPr>
+          <w:rtl w:val="0"/>
+        </w:rPr>
+        <w:t xml:space="preserve">2</w:t>
+      </w:r>
+      <w:r>
+        <w:rPr>
+          <w:vertAlign w:val="baseline"/>
+          <w:rtl w:val="0"/>
+        </w:rPr>
+        <w:t xml:space="preserve">) – Validação de Força da Senha</w:t>
       </w:r>
     </w:p>
     <w:p>
@@ -8029,7 +8817,20 @@
           <w:vertAlign w:val="baseline"/>
           <w:rtl w:val="0"/>
         </w:rPr>
-        <w:t xml:space="preserve">(A01) – Cancelar Cadastro</w:t>
+        <w:t xml:space="preserve">(A0</w:t>
+      </w:r>
+      <w:r>
+        <w:rPr>
+          <w:rtl w:val="0"/>
+        </w:rPr>
+        <w:t xml:space="preserve">2</w:t>
+      </w:r>
+      <w:r>
+        <w:rPr>
+          <w:vertAlign w:val="baseline"/>
+          <w:rtl w:val="0"/>
+        </w:rPr>
+        <w:t xml:space="preserve">) – Cancelar Cadastro</w:t>
       </w:r>
     </w:p>
     <w:p>
@@ -8232,7 +9033,20 @@
           <w:vertAlign w:val="baseline"/>
           <w:rtl w:val="0"/>
         </w:rPr>
-        <w:t xml:space="preserve">(E01) – CPF Inválido ou Já Cadastrado</w:t>
+        <w:t xml:space="preserve">(E0</w:t>
+      </w:r>
+      <w:r>
+        <w:rPr>
+          <w:rtl w:val="0"/>
+        </w:rPr>
+        <w:t xml:space="preserve">2</w:t>
+      </w:r>
+      <w:r>
+        <w:rPr>
+          <w:vertAlign w:val="baseline"/>
+          <w:rtl w:val="0"/>
+        </w:rPr>
+        <w:t xml:space="preserve">) – CPF Inválido ou Já Cadastrado</w:t>
       </w:r>
     </w:p>
     <w:p>
@@ -8439,7 +9253,7 @@
         <w:rPr>
           <w:rtl w:val="0"/>
         </w:rPr>
-        <w:t xml:space="preserve">(E02) – Email já cadastrado</w:t>
+        <w:t xml:space="preserve">(E03) – Email já cadastrado</w:t>
       </w:r>
     </w:p>
     <w:p>
@@ -8617,7 +9431,20 @@
           <w:vertAlign w:val="baseline"/>
           <w:rtl w:val="0"/>
         </w:rPr>
-        <w:t xml:space="preserve">(E03) - Usuário Menor de Ida</w:t>
+        <w:t xml:space="preserve">(E0</w:t>
+      </w:r>
+      <w:r>
+        <w:rPr>
+          <w:rtl w:val="0"/>
+        </w:rPr>
+        <w:t xml:space="preserve">4</w:t>
+      </w:r>
+      <w:r>
+        <w:rPr>
+          <w:vertAlign w:val="baseline"/>
+          <w:rtl w:val="0"/>
+        </w:rPr>
+        <w:t xml:space="preserve">) - Usuário Menor de Ida</w:t>
       </w:r>
       <w:r>
         <w:rPr>
@@ -8896,7 +9723,24 @@
           <w:vertAlign w:val="baseline"/>
           <w:rtl w:val="0"/>
         </w:rPr>
-        <w:t xml:space="preserve">(RE01) - Criptografia e Segurança:</w:t>
+        <w:t xml:space="preserve">(RE0</w:t>
+      </w:r>
+      <w:r>
+        <w:rPr>
+          <w:b w:val="1"/>
+          <w:bCs w:val="1"/>
+          <w:rtl w:val="0"/>
+        </w:rPr>
+        <w:t xml:space="preserve">3</w:t>
+      </w:r>
+      <w:r>
+        <w:rPr>
+          <w:b w:val="1"/>
+          <w:bCs w:val="1"/>
+          <w:vertAlign w:val="baseline"/>
+          <w:rtl w:val="0"/>
+        </w:rPr>
+        <w:t xml:space="preserve">) - Criptografia e Segurança:</w:t>
       </w:r>
     </w:p>
     <w:p>
@@ -8949,7 +9793,24 @@
           <w:vertAlign w:val="baseline"/>
           <w:rtl w:val="0"/>
         </w:rPr>
-        <w:t xml:space="preserve">(RE02) - Conformidade com LGPD:</w:t>
+        <w:t xml:space="preserve">(RE0</w:t>
+      </w:r>
+      <w:r>
+        <w:rPr>
+          <w:b w:val="1"/>
+          <w:bCs w:val="1"/>
+          <w:rtl w:val="0"/>
+        </w:rPr>
+        <w:t xml:space="preserve">4</w:t>
+      </w:r>
+      <w:r>
+        <w:rPr>
+          <w:b w:val="1"/>
+          <w:bCs w:val="1"/>
+          <w:vertAlign w:val="baseline"/>
+          <w:rtl w:val="0"/>
+        </w:rPr>
+        <w:t xml:space="preserve">) - Conformidade com LGPD:</w:t>
       </w:r>
     </w:p>
     <w:p>
@@ -9064,7 +9925,7 @@
           <w:bCs w:val="1"/>
           <w:rtl w:val="0"/>
         </w:rPr>
-        <w:t xml:space="preserve">(RN01) - Validação de Dígito de CPF:</w:t>
+        <w:t xml:space="preserve">(RN03) - Validação de Dígito de CPF:</w:t>
       </w:r>
     </w:p>
     <w:p>
@@ -9111,7 +9972,7 @@
           <w:bCs w:val="1"/>
           <w:rtl w:val="0"/>
         </w:rPr>
-        <w:t xml:space="preserve">(RN02) - Regra de Maioridade:</w:t>
+        <w:t xml:space="preserve">(RN04) - Regra de Maioridade:</w:t>
       </w:r>
     </w:p>
     <w:p>
@@ -9156,7 +10017,7 @@
           <w:bCs w:val="1"/>
           <w:rtl w:val="0"/>
         </w:rPr>
-        <w:t xml:space="preserve">(RN03) - Unicidade de Chaves:</w:t>
+        <w:t xml:space="preserve">(RN05) - Unicidade de Chaves:</w:t>
       </w:r>
     </w:p>
     <w:p>
@@ -9201,7 +10062,7 @@
           <w:bCs w:val="1"/>
           <w:rtl w:val="0"/>
         </w:rPr>
-        <w:t xml:space="preserve">(RN04) - Complexidade de Senha:</w:t>
+        <w:t xml:space="preserve">(RN06) - Complexidade de Senha:</w:t>
       </w:r>
     </w:p>
     <w:p>
@@ -9278,7 +10139,24 @@
           <w:vertAlign w:val="baseline"/>
           <w:rtl w:val="0"/>
         </w:rPr>
-        <w:t xml:space="preserve">(I01) - Nome da Interface com Usuário</w:t>
+        <w:t xml:space="preserve">(I0</w:t>
+      </w:r>
+      <w:r>
+        <w:rPr>
+          <w:b w:val="0"/>
+          <w:bCs w:val="0"/>
+          <w:rtl w:val="0"/>
+        </w:rPr>
+        <w:t xml:space="preserve">2</w:t>
+      </w:r>
+      <w:r>
+        <w:rPr>
+          <w:b w:val="0"/>
+          <w:bCs w:val="0"/>
+          <w:vertAlign w:val="baseline"/>
+          <w:rtl w:val="0"/>
+        </w:rPr>
+        <w:t xml:space="preserve">) - Nome da Interface com Usuário</w:t>
       </w:r>
     </w:p>
     <w:p>
@@ -11481,7 +12359,20 @@
           <w:vertAlign w:val="baseline"/>
           <w:rtl w:val="0"/>
         </w:rPr>
-        <w:t xml:space="preserve">(E01) – Localização Desativada</w:t>
+        <w:t xml:space="preserve">(E0</w:t>
+      </w:r>
+      <w:r>
+        <w:rPr>
+          <w:rtl w:val="0"/>
+        </w:rPr>
+        <w:t xml:space="preserve">5</w:t>
+      </w:r>
+      <w:r>
+        <w:rPr>
+          <w:vertAlign w:val="baseline"/>
+          <w:rtl w:val="0"/>
+        </w:rPr>
+        <w:t xml:space="preserve">) – Localização Desativada</w:t>
       </w:r>
     </w:p>
     <w:p>
@@ -11749,7 +12640,24 @@
           <w:vertAlign w:val="baseline"/>
           <w:rtl w:val="0"/>
         </w:rPr>
-        <w:t xml:space="preserve">(RE01) - Desempenho do Mapa: </w:t>
+        <w:t xml:space="preserve">(RE0</w:t>
+      </w:r>
+      <w:r>
+        <w:rPr>
+          <w:b w:val="1"/>
+          <w:bCs w:val="1"/>
+          <w:rtl w:val="0"/>
+        </w:rPr>
+        <w:t xml:space="preserve">5</w:t>
+      </w:r>
+      <w:r>
+        <w:rPr>
+          <w:b w:val="1"/>
+          <w:bCs w:val="1"/>
+          <w:vertAlign w:val="baseline"/>
+          <w:rtl w:val="0"/>
+        </w:rPr>
+        <w:t xml:space="preserve">) - Desempenho do Mapa: </w:t>
       </w:r>
     </w:p>
     <w:p>
@@ -11807,7 +12715,24 @@
           <w:vertAlign w:val="baseline"/>
           <w:rtl w:val="0"/>
         </w:rPr>
-        <w:t xml:space="preserve">(RE02) - Consumo de Dados:</w:t>
+        <w:t xml:space="preserve">(RE0</w:t>
+      </w:r>
+      <w:r>
+        <w:rPr>
+          <w:b w:val="1"/>
+          <w:bCs w:val="1"/>
+          <w:rtl w:val="0"/>
+        </w:rPr>
+        <w:t xml:space="preserve">6</w:t>
+      </w:r>
+      <w:r>
+        <w:rPr>
+          <w:b w:val="1"/>
+          <w:bCs w:val="1"/>
+          <w:vertAlign w:val="baseline"/>
+          <w:rtl w:val="0"/>
+        </w:rPr>
+        <w:t xml:space="preserve">) - Consumo de Dados:</w:t>
       </w:r>
     </w:p>
     <w:p>
@@ -11891,7 +12816,24 @@
           <w:vertAlign w:val="baseline"/>
           <w:rtl w:val="0"/>
         </w:rPr>
-        <w:t xml:space="preserve">(RN01) - Raio de Alcance: </w:t>
+        <w:t xml:space="preserve">(RN0</w:t>
+      </w:r>
+      <w:r>
+        <w:rPr>
+          <w:b w:val="1"/>
+          <w:bCs w:val="1"/>
+          <w:rtl w:val="0"/>
+        </w:rPr>
+        <w:t xml:space="preserve">7</w:t>
+      </w:r>
+      <w:r>
+        <w:rPr>
+          <w:b w:val="1"/>
+          <w:bCs w:val="1"/>
+          <w:vertAlign w:val="baseline"/>
+          <w:rtl w:val="0"/>
+        </w:rPr>
+        <w:t xml:space="preserve">) - Raio de Alcance: </w:t>
       </w:r>
     </w:p>
     <w:p>
@@ -11964,7 +12906,24 @@
           <w:vertAlign w:val="baseline"/>
           <w:rtl w:val="0"/>
         </w:rPr>
-        <w:t xml:space="preserve">(RN02) - Alerta de Estoque:</w:t>
+        <w:t xml:space="preserve">(RN0</w:t>
+      </w:r>
+      <w:r>
+        <w:rPr>
+          <w:b w:val="1"/>
+          <w:bCs w:val="1"/>
+          <w:rtl w:val="0"/>
+        </w:rPr>
+        <w:t xml:space="preserve">8</w:t>
+      </w:r>
+      <w:r>
+        <w:rPr>
+          <w:b w:val="1"/>
+          <w:bCs w:val="1"/>
+          <w:vertAlign w:val="baseline"/>
+          <w:rtl w:val="0"/>
+        </w:rPr>
+        <w:t xml:space="preserve">) - Alerta de Estoque:</w:t>
       </w:r>
     </w:p>
     <w:p>
@@ -12039,7 +12998,7 @@
         <w:rPr>
           <w:rtl w:val="0"/>
         </w:rPr>
-        <w:t xml:space="preserve">(I01) - Tela de Hemocentros</w:t>
+        <w:t xml:space="preserve">(I03) - Tela de Hemocentros</w:t>
       </w:r>
     </w:p>
     <w:p>
@@ -12066,12 +13025,12 @@
           <wp:inline distB="0" distT="0" distL="0" distR="0">
             <wp:extent cx="1667192" cy="3059789"/>
             <wp:effectExtent b="0" l="0" r="0" t="0"/>
-            <wp:docPr id="2" name="image2.jpg"/>
+            <wp:docPr id="2" name="image1.jpg"/>
             <a:graphic>
               <a:graphicData uri="http://schemas.openxmlformats.org/drawingml/2006/picture">
                 <pic:pic>
                   <pic:nvPicPr>
-                    <pic:cNvPr id="0" name="image2.jpg"/>
+                    <pic:cNvPr id="0" name="image1.jpg"/>
                     <pic:cNvPicPr preferRelativeResize="0"/>
                   </pic:nvPicPr>
                   <pic:blipFill>
@@ -15139,7 +16098,20 @@
           <w:vertAlign w:val="baseline"/>
           <w:rtl w:val="0"/>
         </w:rPr>
-        <w:t xml:space="preserve">(S01) – Filtrar histórico de doações</w:t>
+        <w:t xml:space="preserve">(S0</w:t>
+      </w:r>
+      <w:r>
+        <w:rPr>
+          <w:rtl w:val="0"/>
+        </w:rPr>
+        <w:t xml:space="preserve">3</w:t>
+      </w:r>
+      <w:r>
+        <w:rPr>
+          <w:vertAlign w:val="baseline"/>
+          <w:rtl w:val="0"/>
+        </w:rPr>
+        <w:t xml:space="preserve">) – Filtrar histórico de doações</w:t>
       </w:r>
     </w:p>
     <w:p>
@@ -15278,7 +16250,20 @@
           <w:vertAlign w:val="baseline"/>
           <w:rtl w:val="0"/>
         </w:rPr>
-        <w:t xml:space="preserve">(A01) – Histórico vazio</w:t>
+        <w:t xml:space="preserve">(A0</w:t>
+      </w:r>
+      <w:r>
+        <w:rPr>
+          <w:rtl w:val="0"/>
+        </w:rPr>
+        <w:t xml:space="preserve">3</w:t>
+      </w:r>
+      <w:r>
+        <w:rPr>
+          <w:vertAlign w:val="baseline"/>
+          <w:rtl w:val="0"/>
+        </w:rPr>
+        <w:t xml:space="preserve">) – Histórico vazio</w:t>
       </w:r>
     </w:p>
     <w:p>
@@ -15490,7 +16475,20 @@
           <w:vertAlign w:val="baseline"/>
           <w:rtl w:val="0"/>
         </w:rPr>
-        <w:t xml:space="preserve">(E01) – Usuário não autenticado</w:t>
+        <w:t xml:space="preserve">(E0</w:t>
+      </w:r>
+      <w:r>
+        <w:rPr>
+          <w:rtl w:val="0"/>
+        </w:rPr>
+        <w:t xml:space="preserve">6</w:t>
+      </w:r>
+      <w:r>
+        <w:rPr>
+          <w:vertAlign w:val="baseline"/>
+          <w:rtl w:val="0"/>
+        </w:rPr>
+        <w:t xml:space="preserve">) – Usuário não autenticado</w:t>
       </w:r>
     </w:p>
     <w:p>
@@ -15850,7 +16848,24 @@
           <w:vertAlign w:val="baseline"/>
           <w:rtl w:val="0"/>
         </w:rPr>
-        <w:t xml:space="preserve">(RE01) - Desempenho:</w:t>
+        <w:t xml:space="preserve">(RE0</w:t>
+      </w:r>
+      <w:r>
+        <w:rPr>
+          <w:b w:val="1"/>
+          <w:bCs w:val="1"/>
+          <w:rtl w:val="0"/>
+        </w:rPr>
+        <w:t xml:space="preserve">7</w:t>
+      </w:r>
+      <w:r>
+        <w:rPr>
+          <w:b w:val="1"/>
+          <w:bCs w:val="1"/>
+          <w:vertAlign w:val="baseline"/>
+          <w:rtl w:val="0"/>
+        </w:rPr>
+        <w:t xml:space="preserve">) - Desempenho:</w:t>
       </w:r>
     </w:p>
     <w:p>
@@ -15906,7 +16921,24 @@
           <w:vertAlign w:val="baseline"/>
           <w:rtl w:val="0"/>
         </w:rPr>
-        <w:t xml:space="preserve">(RE02) – Usabilidade:</w:t>
+        <w:t xml:space="preserve">(RE0</w:t>
+      </w:r>
+      <w:r>
+        <w:rPr>
+          <w:b w:val="1"/>
+          <w:bCs w:val="1"/>
+          <w:rtl w:val="0"/>
+        </w:rPr>
+        <w:t xml:space="preserve">8</w:t>
+      </w:r>
+      <w:r>
+        <w:rPr>
+          <w:b w:val="1"/>
+          <w:bCs w:val="1"/>
+          <w:vertAlign w:val="baseline"/>
+          <w:rtl w:val="0"/>
+        </w:rPr>
+        <w:t xml:space="preserve">) – Usabilidade:</w:t>
       </w:r>
     </w:p>
     <w:p>
@@ -15962,7 +16994,24 @@
           <w:vertAlign w:val="baseline"/>
           <w:rtl w:val="0"/>
         </w:rPr>
-        <w:t xml:space="preserve">(RE03) – Segurança:</w:t>
+        <w:t xml:space="preserve">(RE0</w:t>
+      </w:r>
+      <w:r>
+        <w:rPr>
+          <w:b w:val="1"/>
+          <w:bCs w:val="1"/>
+          <w:rtl w:val="0"/>
+        </w:rPr>
+        <w:t xml:space="preserve">9</w:t>
+      </w:r>
+      <w:r>
+        <w:rPr>
+          <w:b w:val="1"/>
+          <w:bCs w:val="1"/>
+          <w:vertAlign w:val="baseline"/>
+          <w:rtl w:val="0"/>
+        </w:rPr>
+        <w:t xml:space="preserve">) – Segurança:</w:t>
       </w:r>
     </w:p>
     <w:p>
@@ -16077,7 +17126,24 @@
           <w:vertAlign w:val="baseline"/>
           <w:rtl w:val="0"/>
         </w:rPr>
-        <w:t xml:space="preserve">(RN01) - Associação de doações</w:t>
+        <w:t xml:space="preserve">(RN0</w:t>
+      </w:r>
+      <w:r>
+        <w:rPr>
+          <w:b w:val="1"/>
+          <w:bCs w:val="1"/>
+          <w:rtl w:val="0"/>
+        </w:rPr>
+        <w:t xml:space="preserve">9</w:t>
+      </w:r>
+      <w:r>
+        <w:rPr>
+          <w:b w:val="1"/>
+          <w:bCs w:val="1"/>
+          <w:vertAlign w:val="baseline"/>
+          <w:rtl w:val="0"/>
+        </w:rPr>
+        <w:t xml:space="preserve">) - Associação de doações</w:t>
       </w:r>
     </w:p>
     <w:p>
@@ -16133,7 +17199,24 @@
           <w:vertAlign w:val="baseline"/>
           <w:rtl w:val="0"/>
         </w:rPr>
-        <w:t xml:space="preserve">(RN02) – Intervalo entre doações</w:t>
+        <w:t xml:space="preserve">(RN</w:t>
+      </w:r>
+      <w:r>
+        <w:rPr>
+          <w:b w:val="1"/>
+          <w:bCs w:val="1"/>
+          <w:rtl w:val="0"/>
+        </w:rPr>
+        <w:t xml:space="preserve">10</w:t>
+      </w:r>
+      <w:r>
+        <w:rPr>
+          <w:b w:val="1"/>
+          <w:bCs w:val="1"/>
+          <w:vertAlign w:val="baseline"/>
+          <w:rtl w:val="0"/>
+        </w:rPr>
+        <w:t xml:space="preserve">) – Intervalo entre doações</w:t>
       </w:r>
     </w:p>
     <w:p>
@@ -16189,7 +17272,24 @@
           <w:vertAlign w:val="baseline"/>
           <w:rtl w:val="0"/>
         </w:rPr>
-        <w:t xml:space="preserve">(RN03) – Status da doação</w:t>
+        <w:t xml:space="preserve">(RN</w:t>
+      </w:r>
+      <w:r>
+        <w:rPr>
+          <w:b w:val="1"/>
+          <w:bCs w:val="1"/>
+          <w:rtl w:val="0"/>
+        </w:rPr>
+        <w:t xml:space="preserve">11</w:t>
+      </w:r>
+      <w:r>
+        <w:rPr>
+          <w:b w:val="1"/>
+          <w:bCs w:val="1"/>
+          <w:vertAlign w:val="baseline"/>
+          <w:rtl w:val="0"/>
+        </w:rPr>
+        <w:t xml:space="preserve">) – Status da doação</w:t>
       </w:r>
     </w:p>
     <w:p>
@@ -16281,7 +17381,20 @@
           <w:vertAlign w:val="baseline"/>
           <w:rtl w:val="0"/>
         </w:rPr>
-        <w:t xml:space="preserve">(I01) - Tela de Histórico de Doações</w:t>
+        <w:t xml:space="preserve">(I0</w:t>
+      </w:r>
+      <w:r>
+        <w:rPr>
+          <w:rtl w:val="0"/>
+        </w:rPr>
+        <w:t xml:space="preserve">4</w:t>
+      </w:r>
+      <w:r>
+        <w:rPr>
+          <w:vertAlign w:val="baseline"/>
+          <w:rtl w:val="0"/>
+        </w:rPr>
+        <w:t xml:space="preserve">) - Tela de Histórico de Doações</w:t>
       </w:r>
     </w:p>
     <w:p>

</xml_diff>